<commit_message>
docs(bundle): add LaTeX PDFs to non-Emerald primaries; refresh normalized docx
Co-Authored-By: Claude Opus 4.8 (1M context) <noreply@anthropic.com>
Claude-Session: https://claude.ai/code/session_01Xumaoraa2DLWLXsgJJ62oq
</commit_message>
<xml_diff>
--- a/dist/BO_NOP_HOAN_CHINH_2026-06/1_papers/P3_JED/01_manuscript_blinded.docx
+++ b/dist/BO_NOP_HOAN_CHINH_2026-06/1_papers/P3_JED/01_manuscript_blinded.docx
@@ -2,7 +2,7 @@
 <file path=word/document.xml><?xml version="1.0" encoding="utf-8"?>
 <w:document xmlns:w="http://schemas.openxmlformats.org/wordprocessingml/2006/main" xmlns:m="http://schemas.openxmlformats.org/officeDocument/2006/math" xmlns:r="http://schemas.openxmlformats.org/officeDocument/2006/relationships" xmlns:o="urn:schemas-microsoft-com:office:office" xmlns:v="urn:schemas-microsoft-com:vml" xmlns:w10="urn:schemas-microsoft-com:office:word" xmlns:a="http://schemas.openxmlformats.org/drawingml/2006/main" xmlns:pic="http://schemas.openxmlformats.org/drawingml/2006/picture" xmlns:wp="http://schemas.openxmlformats.org/drawingml/2006/wordprocessingDrawing">
   <w:body>
-    <w:bookmarkStart w:id="107" w:name="X0264dbef037d515bdd41c0931e5e2e7c8717b18"/>
+    <w:bookmarkStart w:id="56" w:name="X0264dbef037d515bdd41c0931e5e2e7c8717b18"/>
     <w:p>
       <w:pPr>
         <w:pStyle w:val="Heading1"/>
@@ -101,7 +101,37 @@
         <w:t xml:space="preserve"> </w:t>
       </w:r>
       <w:r>
-        <w:t xml:space="preserve">The inverted-U in this zero-inflated setting reflects a participation-barrier effect rather than intensity saturation; pooled Tier-1 coefficients mask progressive proxy obsolescence. The institutionally embedded turning-point cluster (39–46% FSTS) shifts the debate from 'does internationalisation help?' to 'under what institutional conditions does the threshold shift?'</w:t>
+        <w:t xml:space="preserve">The inverted-U in this zero-inflated setting reflects a participation-barrier effect rather than intensity saturation; pooled Tier-1 coefficients mask progressive proxy obsolescence. The institutionally embedded turning-point cluster (39–46% FSTS) shifts the debate from</w:t>
+      </w:r>
+      <w:r>
+        <w:t xml:space="preserve"> </w:t>
+      </w:r>
+      <w:r>
+        <w:t xml:space="preserve">‘</w:t>
+      </w:r>
+      <w:r>
+        <w:t xml:space="preserve">does internationalisation help?</w:t>
+      </w:r>
+      <w:r>
+        <w:t xml:space="preserve">’</w:t>
+      </w:r>
+      <w:r>
+        <w:t xml:space="preserve"> </w:t>
+      </w:r>
+      <w:r>
+        <w:t xml:space="preserve">to</w:t>
+      </w:r>
+      <w:r>
+        <w:t xml:space="preserve"> </w:t>
+      </w:r>
+      <w:r>
+        <w:t xml:space="preserve">‘</w:t>
+      </w:r>
+      <w:r>
+        <w:t xml:space="preserve">under what institutional conditions does the threshold shift?</w:t>
+      </w:r>
+      <w:r>
+        <w:t xml:space="preserve">’</w:t>
       </w:r>
     </w:p>
     <w:p>
@@ -129,7 +159,7 @@
       </w:r>
     </w:p>
     <w:bookmarkEnd w:id="20"/>
-    <w:bookmarkStart w:id="21" w:name="Xe3d0fc0bea9a42ce7605565d0964033d7f6ee47"/>
+    <w:bookmarkStart w:id="21" w:name="introduction"/>
     <w:p>
       <w:pPr>
         <w:pStyle w:val="Heading2"/>
@@ -216,7 +246,7 @@
         <w:t xml:space="preserve">et al.</w:t>
       </w:r>
       <w:r>
-        <w:t xml:space="preserve">, 2021; Petricevic and Teece, 2019). This raises the study's central question: does digital capability in Vietnam function as a stable performance-enhancing asset, or as a stage-contingent resource whose value changes over the lifecycle of internationalisation?</w:t>
+        <w:t xml:space="preserve">, 2021; Petricevic and Teece, 2019). This raises the study’s central question: does digital capability in Vietnam function as a stable performance-enhancing asset, or as a stage-contingent resource whose value changes over the lifecycle of internationalisation?</w:t>
       </w:r>
     </w:p>
     <w:p>
@@ -311,7 +341,7 @@
         <w:t xml:space="preserve"> </w:t>
       </w:r>
       <w:r>
-        <w:t xml:space="preserve">(2022) show that institutional context moderates I–P effect sizes more powerfully than firm-level capability. Within-country longitudinal designs, which hold institutional context constant while varying time, therefore provide a more credible test of whether the inverted-U is an artefact of cross-national pooling; Vietnam's three-wave WBES panel provides exactly this design.</w:t>
+        <w:t xml:space="preserve">(2022) show that institutional context moderates I–P effect sizes more powerfully than firm-level capability. Within-country longitudinal designs, which hold institutional context constant while varying time, therefore provide a more credible test of whether the inverted-U is an artefact of cross-national pooling; Vietnam’s three-wave WBES panel provides exactly this design.</w:t>
       </w:r>
     </w:p>
     <w:p>
@@ -323,7 +353,7 @@
       </w:r>
     </w:p>
     <w:bookmarkEnd w:id="21"/>
-    <w:bookmarkStart w:id="29" w:name="X8bf20a63f0decf7b16e99d564b9958ec4fbbb23"/>
+    <w:bookmarkStart w:id="29" w:name="theory-and-hypotheses"/>
     <w:p>
       <w:pPr>
         <w:pStyle w:val="Heading2"/>
@@ -332,7 +362,7 @@
         <w:t xml:space="preserve">2. Theory and hypotheses</w:t>
       </w:r>
     </w:p>
-    <w:bookmarkStart w:id="22" w:name="X475e56b016e644d98a8e16bb390e9ef0dd93722"/>
+    <w:bookmarkStart w:id="22" w:name="X3b7d35b763b13aa013dc5c38abee688672fbd10"/>
     <w:p>
       <w:pPr>
         <w:pStyle w:val="Heading3"/>
@@ -406,7 +436,7 @@
         <w:t xml:space="preserve"> </w:t>
       </w:r>
       <w:r>
-        <w:t xml:space="preserve">In Vietnam's zero-inflated export setting, the internationalisation–performance relationship is non-monotonic in the full sample and is best understood through a participation-and-intensity structure, because the coordination-cost and learning mechanisms operate differently at the participation margin versus within the exporter subsample (Hennart, 2007; Wagner, 2007).</w:t>
+        <w:t xml:space="preserve">In Vietnam’s zero-inflated export setting, the internationalisation–performance relationship is non-monotonic in the full sample and is best understood through a participation-and-intensity structure, because the coordination-cost and learning mechanisms operate differently at the participation margin versus within the exporter subsample (Hennart, 2007; Wagner, 2007).</w:t>
       </w:r>
       <w:r>
         <w:t xml:space="preserve"> </w:t>
@@ -442,7 +472,7 @@
       </w:r>
     </w:p>
     <w:bookmarkEnd w:id="22"/>
-    <w:bookmarkStart w:id="23" w:name="X3d12e708079560cdc1ff0e61370aee89ebe94e7"/>
+    <w:bookmarkStart w:id="23" w:name="X8b6ab3bfb99752d9beaf4133c4607c74858df36"/>
     <w:p>
       <w:pPr>
         <w:pStyle w:val="Heading3"/>
@@ -456,7 +486,7 @@
         <w:pStyle w:val="FirstParagraph"/>
       </w:pPr>
       <w:r>
-        <w:t xml:space="preserve">Following the Lall (1992) tradition for emerging-market firms, this paper uses a measurement-tight reading of technological capability: a foreign-technology and standards capability that captures a firm's exposure to externally validated technological inputs: internationally recognised quality certification and foreign-licensed technology. This is one observable facet of the broader Cohen and Levinthal (1990) absorptive-capacity construct and the dynamic-capability construct of Teece (2007), but the measure does not claim to identify the full absorptive-capacity stock; it captures the externally facing component (Eisenhardt and Martin, 2000; Karna</w:t>
+        <w:t xml:space="preserve">Following the Lall (1992) tradition for emerging-market firms, this paper uses a measurement-tight reading of technological capability: a foreign-technology and standards capability that captures a firm’s exposure to externally validated technological inputs: internationally recognised quality certification and foreign-licensed technology. This is one observable facet of the broader Cohen and Levinthal (1990) absorptive-capacity construct and the dynamic-capability construct of Teece (2007), but the measure does not claim to identify the full absorptive-capacity stock; it captures the externally facing component (Eisenhardt and Martin, 2000; Karna</w:t>
       </w:r>
       <w:r>
         <w:t xml:space="preserve"> </w:t>
@@ -487,11 +517,11 @@
         <w:t xml:space="preserve"> </w:t>
       </w:r>
       <w:r>
-        <w:t xml:space="preserve">In Vietnam's transitional export environment, stronger foreign-technology and standards capability (TCI_z) is associated with higher labour productivity, because exposure to internationally recognised quality certification and foreign-licensed technology raises a firm's capacity to meet foreign-market requirements and integrate external technological inputs into production routines (Lall, 1992; Cohen and Levinthal, 1990), before the premium from this channel is bounded by the firm's absorptive depth relative to the full innovation-and-R&amp;D stock (Eisenhardt and Martin, 2000).</w:t>
+        <w:t xml:space="preserve">In Vietnam’s transitional export environment, stronger foreign-technology and standards capability (TCI_z) is associated with higher labour productivity, because exposure to internationally recognised quality certification and foreign-licensed technology raises a firm’s capacity to meet foreign-market requirements and integrate external technological inputs into production routines (Lall, 1992; Cohen and Levinthal, 1990), before the premium from this channel is bounded by the firm’s absorptive depth relative to the full innovation-and-R&amp;D stock (Eisenhardt and Martin, 2000).</w:t>
       </w:r>
     </w:p>
     <w:bookmarkEnd w:id="23"/>
-    <w:bookmarkStart w:id="24" w:name="X02827d6cc0af65ac39b2d56f2f17672268c2f6b"/>
+    <w:bookmarkStart w:id="24" w:name="Xc172df63165a200a03f115512b27dddb3cfd513"/>
     <w:p>
       <w:pPr>
         <w:pStyle w:val="Heading3"/>
@@ -587,11 +617,11 @@
         <w:t xml:space="preserve">not formalised as a primary hypothesis-bearing construct</w:t>
       </w:r>
       <w:r>
-        <w:t xml:space="preserve">; it is retained in all specifications as a baseline digital-presence control, reported descriptively. Accordingly no H3 is formulated here; the exploratory probe that follows (§2.4) is designated H4 to preserve alignment with the broader dissertation framework, in which H3 conventionally corresponds to institutional moderation in multi-country papers.</w:t>
+        <w:t xml:space="preserve">; it is retained in all specifications as a baseline digital-presence control, reported descriptively. Accordingly no H3 is formulated here; the exploratory probe that follows (Section 2.4) is designated H4 to preserve alignment with the broader dissertation framework, in which H3 conventionally corresponds to institutional moderation in multi-country papers.</w:t>
       </w:r>
     </w:p>
     <w:bookmarkEnd w:id="24"/>
-    <w:bookmarkStart w:id="28" w:name="Xa301591a4bdc42129e76c2a2b73514232150381"/>
+    <w:bookmarkStart w:id="28" w:name="stage-contingent-digital-value"/>
     <w:p>
       <w:pPr>
         <w:pStyle w:val="Heading3"/>
@@ -654,12 +684,12 @@
     </w:p>
     <w:p>
       <w:pPr>
-        <w:pStyle w:val="BodyText"/>
+        <w:pStyle w:val="CaptionedFigure"/>
       </w:pPr>
       <w:r>
         <w:drawing>
           <wp:inline>
-            <wp:extent cx="5334000" cy="2930266"/>
+            <wp:extent cx="5753100" cy="3160501"/>
             <wp:effectExtent b="0" l="0" r="0" t="0"/>
             <wp:docPr descr="Figure 1: Conceptual model" title="" id="26" name="Picture"/>
             <a:graphic>
@@ -680,7 +710,7 @@
                   <pic:spPr bwMode="auto">
                     <a:xfrm>
                       <a:off x="0" y="0"/>
-                      <a:ext cx="5334000" cy="2930266"/>
+                      <a:ext cx="5753100" cy="3160501"/>
                     </a:xfrm>
                     <a:prstGeom prst="rect">
                       <a:avLst/>
@@ -701,6 +731,14 @@
     </w:p>
     <w:p>
       <w:pPr>
+        <w:pStyle w:val="ImageCaption"/>
+      </w:pPr>
+      <w:r>
+        <w:t xml:space="preserve">Figure 1: Conceptual model</w:t>
+      </w:r>
+    </w:p>
+    <w:p>
+      <w:pPr>
         <w:pStyle w:val="BodyText"/>
       </w:pPr>
       <w:r>
@@ -732,7 +770,7 @@
     </w:p>
     <w:bookmarkEnd w:id="28"/>
     <w:bookmarkEnd w:id="29"/>
-    <w:bookmarkStart w:id="35" w:name="Xfd2f05febb90fd7f58b14547dd9b33901f267a5"/>
+    <w:bookmarkStart w:id="35" w:name="data-variables-and-empirical-strategy"/>
     <w:p>
       <w:pPr>
         <w:pStyle w:val="Heading2"/>
@@ -741,7 +779,7 @@
         <w:t xml:space="preserve">3. Data, variables, and empirical strategy</w:t>
       </w:r>
     </w:p>
-    <w:bookmarkStart w:id="30" w:name="X690a6f2a93b97075aa335e9e4cac18d5293d91d"/>
+    <w:bookmarkStart w:id="30" w:name="data-structure"/>
     <w:p>
       <w:pPr>
         <w:pStyle w:val="Heading3"/>
@@ -759,7 +797,7 @@
       </w:r>
     </w:p>
     <w:bookmarkEnd w:id="30"/>
-    <w:bookmarkStart w:id="31" w:name="Xbcf9f12e79107fa2c089aaf13fc6c4fb773f1c2"/>
+    <w:bookmarkStart w:id="31" w:name="variables"/>
     <w:p>
       <w:pPr>
         <w:pStyle w:val="Heading3"/>
@@ -785,7 +823,7 @@
       </w:r>
     </w:p>
     <w:bookmarkEnd w:id="31"/>
-    <w:bookmarkStart w:id="32" w:name="Xc5fe1f3cf583535f12a87a680dcd317400b3da2"/>
+    <w:bookmarkStart w:id="32" w:name="model-sequence"/>
     <w:p>
       <w:pPr>
         <w:pStyle w:val="Heading3"/>
@@ -858,7 +896,7 @@
       </w:r>
     </w:p>
     <w:bookmarkEnd w:id="32"/>
-    <w:bookmarkStart w:id="33" w:name="X5dfcc707f47c17b6c5ab89b577ca56bbb60310f"/>
+    <w:bookmarkStart w:id="33" w:name="identification-and-endogeneity"/>
     <w:p>
       <w:pPr>
         <w:pStyle w:val="Heading3"/>
@@ -889,7 +927,7 @@
       </w:r>
     </w:p>
     <w:bookmarkEnd w:id="33"/>
-    <w:bookmarkStart w:id="34" w:name="X976281aae9d7cc6accc3a8a15180eec1c0b7e58"/>
+    <w:bookmarkStart w:id="34" w:name="replication-and-reproducibility"/>
     <w:p>
       <w:pPr>
         <w:pStyle w:val="Heading3"/>
@@ -937,7 +975,7 @@
     </w:p>
     <w:bookmarkEnd w:id="34"/>
     <w:bookmarkEnd w:id="35"/>
-    <w:bookmarkStart w:id="44" w:name="X121719332867ee227f0a04b486098cee978c6e6"/>
+    <w:bookmarkStart w:id="44" w:name="results"/>
     <w:p>
       <w:pPr>
         <w:pStyle w:val="Heading2"/>
@@ -962,7 +1000,7 @@
         <w:t xml:space="preserve">[Insert Table II about here]</w:t>
       </w:r>
     </w:p>
-    <w:bookmarkStart w:id="36" w:name="X0cdd773083ddb6504e3d3ab10ff1c76267ec612"/>
+    <w:bookmarkStart w:id="36" w:name="wave-specific-findings"/>
     <w:p>
       <w:pPr>
         <w:pStyle w:val="Heading3"/>
@@ -1013,11 +1051,11 @@
         <w:pStyle w:val="BodyText"/>
       </w:pPr>
       <w:r>
-        <w:t xml:space="preserve">Taken together, the wave-specific results trace two associations consistent with stage contingency. Foreign-technology / standards capability is positive across all three waves with a modestly attenuating magnitude (TCI_z = 0.215 → 0.128 → 0.123) but moderation that survives in the 2009, 2023 and pooled panels. Website-based digital presence follows a non-monotonic trajectory (strong in 2009, null in 2015, re-emerging in 2023), and its moderation channel materialises only in 2023. A formal pooled wave × focal interaction test suggests that only the DAI direct shifts are cross-wave-distinguishable, so we read the pattern as wave-specific associations consistent with stage contingency rather than a fully cross-wave-identified structural shift.</w:t>
+        <w:t xml:space="preserve">Taken together, the wave-specific results trace two associations consistent with stage contingency. Foreign-technology / standards capability is positive across all three waves with a modestly attenuating magnitude (TCI_z = 0.215 to 0.128 to 0.123) but moderation that survives in the 2009, 2023 and pooled panels. Website-based digital presence follows a non-monotonic trajectory (strong in 2009, null in 2015, re-emerging in 2023), and its moderation channel materialises only in 2023. A formal pooled wave × focal interaction test suggests that only the DAI direct shifts are cross-wave-distinguishable, so we read the pattern as wave-specific associations consistent with stage contingency rather than a fully cross-wave-identified structural shift.</w:t>
       </w:r>
     </w:p>
     <w:bookmarkEnd w:id="36"/>
-    <w:bookmarkStart w:id="40" w:name="Xaa4851a9c1b3e08eeca0ab72ae930e2b05bff75"/>
+    <w:bookmarkStart w:id="40" w:name="pooled-findings"/>
     <w:p>
       <w:pPr>
         <w:pStyle w:val="Heading3"/>
@@ -1073,12 +1111,12 @@
     </w:p>
     <w:p>
       <w:pPr>
-        <w:pStyle w:val="BodyText"/>
+        <w:pStyle w:val="CaptionedFigure"/>
       </w:pPr>
       <w:r>
         <w:drawing>
           <wp:inline>
-            <wp:extent cx="5334000" cy="3555999"/>
+            <wp:extent cx="5753100" cy="3835399"/>
             <wp:effectExtent b="0" l="0" r="0" t="0"/>
             <wp:docPr descr="Figure 2: Predicted ln(labour productivity) versus FSTS, by wave and pooled" title="" id="38" name="Picture"/>
             <a:graphic>
@@ -1099,7 +1137,7 @@
                   <pic:spPr bwMode="auto">
                     <a:xfrm>
                       <a:off x="0" y="0"/>
-                      <a:ext cx="5334000" cy="3555999"/>
+                      <a:ext cx="5753100" cy="3835399"/>
                     </a:xfrm>
                     <a:prstGeom prst="rect">
                       <a:avLst/>
@@ -1120,6 +1158,14 @@
     </w:p>
     <w:p>
       <w:pPr>
+        <w:pStyle w:val="ImageCaption"/>
+      </w:pPr>
+      <w:r>
+        <w:t xml:space="preserve">Figure 2: Predicted ln(labour productivity) versus FSTS, by wave and pooled</w:t>
+      </w:r>
+    </w:p>
+    <w:p>
+      <w:pPr>
         <w:pStyle w:val="BodyText"/>
       </w:pPr>
       <w:r>
@@ -1137,7 +1183,7 @@
       </w:r>
     </w:p>
     <w:bookmarkEnd w:id="40"/>
-    <w:bookmarkStart w:id="41" w:name="X41c3dce096fbfa1c0be6a58d0741b2aa56fb860"/>
+    <w:bookmarkStart w:id="41" w:name="interpretation-of-the-hypothesis-tests"/>
     <w:p>
       <w:pPr>
         <w:pStyle w:val="Heading3"/>
@@ -1221,7 +1267,7 @@
       </w:r>
     </w:p>
     <w:bookmarkEnd w:id="41"/>
-    <w:bookmarkStart w:id="42" w:name="X3b4c7e0874095eca8ced8b4f3eaf74e392e9461"/>
+    <w:bookmarkStart w:id="42" w:name="X23d394b5fab5dc8f1b4dd565bcba255732d0503"/>
     <w:p>
       <w:pPr>
         <w:pStyle w:val="Heading3"/>
@@ -1239,7 +1285,7 @@
       </w:r>
     </w:p>
     <w:bookmarkEnd w:id="42"/>
-    <w:bookmarkStart w:id="43" w:name="Xa4c02e0b9d1c1dfbd229ca8e93a765eb24721f0"/>
+    <w:bookmarkStart w:id="43" w:name="robustness"/>
     <w:p>
       <w:pPr>
         <w:pStyle w:val="Heading3"/>
@@ -1258,7 +1304,7 @@
     </w:p>
     <w:bookmarkEnd w:id="43"/>
     <w:bookmarkEnd w:id="44"/>
-    <w:bookmarkStart w:id="45" w:name="X735612638e4e736e4693e459c258977262c0dfc"/>
+    <w:bookmarkStart w:id="45" w:name="discussion"/>
     <w:p>
       <w:pPr>
         <w:pStyle w:val="Heading2"/>
@@ -1328,15 +1374,15 @@
         <w:pStyle w:val="BodyText"/>
       </w:pPr>
       <w:r>
-        <w:t xml:space="preserve">The 2015 null should be grounded in the micro-structure of the sample. The exporter share fell from 28.4% in 2009 to 20.7% in 2015, a selective exit that left a residual cohort disproportionately concentrated in labour-intensive, OEM-dependent assembly operations, for which a basic website functions as a digital pamphlet rather than a productivity-enabling coordination tool. Reinforced by proxy obsolescence (by 2015 website ownership had diffused sufficiently that c22b could no longer separate digitally capable exporters from routine web presence), this helps explain why the DAI coefficient compresses to a null even as the inverted-U curvature remains present. Public secondary indicators make the institutional reading plausible without entering the regression: Vietnam's internet-use share rose from roughly 26% (2009) to 45% (2015) to over 78% (2023) (World Bank, 2026; International Telecommunication Union, 2026), and cross-border e-payment and B2B marketplaces reached scale only after 2018–2019, following the 2020 National Digital Transformation Programme. The 2015 wave therefore observes exporters before a transaction-supporting digital ecosystem had matured; the dip shows why pooled averages alone are insufficient, as capability payoffs can compress temporarily before re-emerging.</w:t>
-      </w:r>
-    </w:p>
-    <w:p>
-      <w:pPr>
-        <w:pStyle w:val="BodyText"/>
-      </w:pPr>
-      <w:r>
-        <w:t xml:space="preserve">The managerial implication is not that firms should invest less in digitalisation, but that the composition of capability investment should change with the firm's position relative to two empirically anchored thresholds: the export-participation barrier and the inverted-U turning-point band at 39–46% FSTS. For pre-export and low-intensity firms, the dominant productivity-relevant action is crossing the participation barrier (foreign-market intelligence, quality certification, entry-cost financing) rather than optimising Tier-1 website presence, whose contribution is bounded by the diffusion-driven attenuation of c22b. Approaching and beyond the turning-point band, the TCI direct association (pooled β = 0.179; instrumented β = 1.639) and its curvature-flattening moderation imply that capital should tilt toward TCI-deepening investments (foreign-licensed technology, certification systems, process integration with foreign principals), while the negative 2023 FSTS × DAI_z interaction implies that marginal Tier-1 website investment delivers a negative incremental association, the binding friction being the absence of Tier 2–3 process, payment, and supply-chain digitisation. Managers should therefore not conflate basic digital adoption with deeper technological capability, and should stage allocation against the empirically identified thresholds rather than generic digital-transformation prescriptions.</w:t>
+        <w:t xml:space="preserve">The 2015 null should be grounded in the micro-structure of the sample. The exporter share fell from 28.4% in 2009 to 20.7% in 2015, a selective exit that left a residual cohort disproportionately concentrated in labour-intensive, OEM-dependent assembly operations, for which a basic website functions as a digital pamphlet rather than a productivity-enabling coordination tool. Reinforced by proxy obsolescence (by 2015 website ownership had diffused sufficiently that c22b could no longer separate digitally capable exporters from routine web presence), this helps explain why the DAI coefficient compresses to a null even as the inverted-U curvature remains present. Public secondary indicators make the institutional reading plausible without entering the regression: Vietnam’s internet-use share rose from roughly 26% (2009) to 45% (2015) to over 78% (2023) (World Bank, 2026; International Telecommunication Union, 2026), and cross-border e-payment and B2B marketplaces reached scale only after 2018–2019, following the 2020 National Digital Transformation Programme. The 2015 wave therefore observes exporters before a transaction-supporting digital ecosystem had matured; the dip shows why pooled averages alone are insufficient, as capability payoffs can compress temporarily before re-emerging.</w:t>
+      </w:r>
+    </w:p>
+    <w:p>
+      <w:pPr>
+        <w:pStyle w:val="BodyText"/>
+      </w:pPr>
+      <w:r>
+        <w:t xml:space="preserve">The managerial implication is not that firms should invest less in digitalisation, but that the composition of capability investment should change with the firm’s position relative to two empirically anchored thresholds: the export-participation barrier and the inverted-U turning-point band at 39–46% FSTS. For pre-export and low-intensity firms, the dominant productivity-relevant action is crossing the participation barrier (foreign-market intelligence, quality certification, entry-cost financing) rather than optimising Tier-1 website presence, whose contribution is bounded by the diffusion-driven attenuation of c22b. Approaching and beyond the turning-point band, the TCI direct association (pooled β = 0.179; instrumented β = 1.639) and its curvature-flattening moderation imply that capital should tilt toward TCI-deepening investments (foreign-licensed technology, certification systems, process integration with foreign principals), while the negative 2023 FSTS × DAI_z interaction implies that marginal Tier-1 website investment delivers a negative incremental association, the binding friction being the absence of Tier 2–3 process, payment, and supply-chain digitisation. Managers should therefore not conflate basic digital adoption with deeper technological capability, and should stage allocation against the empirically identified thresholds rather than generic digital-transformation prescriptions.</w:t>
       </w:r>
     </w:p>
     <w:p>
@@ -1348,7 +1394,7 @@
       </w:r>
     </w:p>
     <w:bookmarkEnd w:id="45"/>
-    <w:bookmarkStart w:id="46" w:name="Xf3d63d3bef15b3e862b66ed5bd48a577996a1bc"/>
+    <w:bookmarkStart w:id="46" w:name="limitations-and-future-research"/>
     <w:p>
       <w:pPr>
         <w:pStyle w:val="Heading2"/>
@@ -1382,7 +1428,7 @@
       </w:r>
     </w:p>
     <w:bookmarkEnd w:id="46"/>
-    <w:bookmarkStart w:id="47" w:name="X19cad7d15381a9dfa000caf49ac5c69889e188d"/>
+    <w:bookmarkStart w:id="47" w:name="conclusion"/>
     <w:p>
       <w:pPr>
         <w:pStyle w:val="Heading2"/>
@@ -1486,7 +1532,7 @@
         <w:pStyle w:val="FirstParagraph"/>
       </w:pPr>
       <w:r>
-        <w:t xml:space="preserve">In preparing this manuscript, the author(s) used Grammarly, a writing-assistance tool, to help correct spelling, grammar, and punctuation in the author(s)' own original text. No generative artificial-intelligence tool was used to generate, draft, or create any substantive content, analysis, or interpretation. All conceptual framing, hypothesis development, empirical analysis, results interpretation, and final wording were produced by the human author(s), who take full responsibility for the content of the publication.</w:t>
+        <w:t xml:space="preserve">In preparing this manuscript, the author(s) used Grammarly, a writing-assistance tool, to help correct spelling, grammar, and punctuation in the author(s)’ own original text. No generative artificial-intelligence tool was used to generate, draft, or create any substantive content, analysis, or interpretation. All conceptual framing, hypothesis development, empirical analysis, results interpretation, and final wording were produced by the human author(s), who take full responsibility for the content of the publication.</w:t>
       </w:r>
     </w:p>
     <w:bookmarkEnd w:id="52"/>
@@ -1535,7 +1581,7 @@
       </w:r>
     </w:p>
     <w:bookmarkEnd w:id="54"/>
-    <w:bookmarkStart w:id="106" w:name="references"/>
+    <w:bookmarkStart w:id="55" w:name="references"/>
     <w:p>
       <w:pPr>
         <w:pStyle w:val="Heading2"/>
@@ -1549,7 +1595,22 @@
         <w:pStyle w:val="FirstParagraph"/>
       </w:pPr>
       <w:r>
-        <w:t xml:space="preserve">Aguinis, H., Hill, N.S. and Bailey, J.R. (2021), "Best practices in data collection and preparation: recommendations for reviewers, editors, and authors",</w:t>
+        <w:t xml:space="preserve">Aguinis, H., Hill, N.S. and Bailey, J.R. (2021),</w:t>
+      </w:r>
+      <w:r>
+        <w:t xml:space="preserve"> </w:t>
+      </w:r>
+      <w:r>
+        <w:t xml:space="preserve">“</w:t>
+      </w:r>
+      <w:r>
+        <w:t xml:space="preserve">Best practices in data collection and preparation: recommendations for reviewers, editors, and authors</w:t>
+      </w:r>
+      <w:r>
+        <w:t xml:space="preserve">”</w:t>
+      </w:r>
+      <w:r>
+        <w:t xml:space="preserve">,</w:t>
       </w:r>
       <w:r>
         <w:t xml:space="preserve"> </w:t>
@@ -1562,26 +1623,30 @@
         <w:t xml:space="preserve">Organizational Research Methods</w:t>
       </w:r>
       <w:r>
-        <w:t xml:space="preserve">, Vol. 24 No. 4, pp.678-693,</w:t>
-      </w:r>
-      <w:r>
-        <w:t xml:space="preserve"> </w:t>
-      </w:r>
-      <w:hyperlink r:id="rId55">
-        <w:r>
-          <w:rPr>
-            <w:rStyle w:val="Hyperlink"/>
-          </w:rPr>
-          <w:t xml:space="preserve">https://doi.org/10.1177/1094428119836485</w:t>
-        </w:r>
-      </w:hyperlink>
-    </w:p>
-    <w:p>
-      <w:pPr>
-        <w:pStyle w:val="BodyText"/>
-      </w:pPr>
-      <w:r>
-        <w:t xml:space="preserve">Antonakis, J., Bendahan, S., Jacquart, P. and Lalive, R. (2010), "On making causal claims: a review and recommendations",</w:t>
+        <w:t xml:space="preserve">, Vol. 24 No. 4, pp.678-693, https://doi.org/10.1177/1094428119836485</w:t>
+      </w:r>
+    </w:p>
+    <w:p>
+      <w:pPr>
+        <w:pStyle w:val="BodyText"/>
+      </w:pPr>
+      <w:r>
+        <w:t xml:space="preserve">Antonakis, J., Bendahan, S., Jacquart, P. and Lalive, R. (2010),</w:t>
+      </w:r>
+      <w:r>
+        <w:t xml:space="preserve"> </w:t>
+      </w:r>
+      <w:r>
+        <w:t xml:space="preserve">“</w:t>
+      </w:r>
+      <w:r>
+        <w:t xml:space="preserve">On making causal claims: a review and recommendations</w:t>
+      </w:r>
+      <w:r>
+        <w:t xml:space="preserve">”</w:t>
+      </w:r>
+      <w:r>
+        <w:t xml:space="preserve">,</w:t>
       </w:r>
       <w:r>
         <w:t xml:space="preserve"> </w:t>
@@ -1594,26 +1659,30 @@
         <w:t xml:space="preserve">The Leadership Quarterly</w:t>
       </w:r>
       <w:r>
-        <w:t xml:space="preserve">, Vol. 21 No. 6, pp.1086-1120,</w:t>
-      </w:r>
-      <w:r>
-        <w:t xml:space="preserve"> </w:t>
-      </w:r>
-      <w:hyperlink r:id="rId56">
-        <w:r>
-          <w:rPr>
-            <w:rStyle w:val="Hyperlink"/>
-          </w:rPr>
-          <w:t xml:space="preserve">https://doi.org/10.1016/j.leaqua.2010.10.010</w:t>
-        </w:r>
-      </w:hyperlink>
-    </w:p>
-    <w:p>
-      <w:pPr>
-        <w:pStyle w:val="BodyText"/>
-      </w:pPr>
-      <w:r>
-        <w:t xml:space="preserve">Banalieva, E.R. and Dhanaraj, C. (2019), "Internalization theory for the digital economy",</w:t>
+        <w:t xml:space="preserve">, Vol. 21 No. 6, pp.1086-1120, https://doi.org/10.1016/j.leaqua.2010.10.010</w:t>
+      </w:r>
+    </w:p>
+    <w:p>
+      <w:pPr>
+        <w:pStyle w:val="BodyText"/>
+      </w:pPr>
+      <w:r>
+        <w:t xml:space="preserve">Banalieva, E.R. and Dhanaraj, C. (2019),</w:t>
+      </w:r>
+      <w:r>
+        <w:t xml:space="preserve"> </w:t>
+      </w:r>
+      <w:r>
+        <w:t xml:space="preserve">“</w:t>
+      </w:r>
+      <w:r>
+        <w:t xml:space="preserve">Internalization theory for the digital economy</w:t>
+      </w:r>
+      <w:r>
+        <w:t xml:space="preserve">”</w:t>
+      </w:r>
+      <w:r>
+        <w:t xml:space="preserve">,</w:t>
       </w:r>
       <w:r>
         <w:t xml:space="preserve"> </w:t>
@@ -1626,26 +1695,30 @@
         <w:t xml:space="preserve">Journal of International Business Studies</w:t>
       </w:r>
       <w:r>
-        <w:t xml:space="preserve">, Vol. 50 No. 8, pp.1372-1387,</w:t>
-      </w:r>
-      <w:r>
-        <w:t xml:space="preserve"> </w:t>
-      </w:r>
-      <w:hyperlink r:id="rId57">
-        <w:r>
-          <w:rPr>
-            <w:rStyle w:val="Hyperlink"/>
-          </w:rPr>
-          <w:t xml:space="preserve">https://doi.org/10.1057/s41267-019-00243-7</w:t>
-        </w:r>
-      </w:hyperlink>
-    </w:p>
-    <w:p>
-      <w:pPr>
-        <w:pStyle w:val="BodyText"/>
-      </w:pPr>
-      <w:r>
-        <w:t xml:space="preserve">Barney, J. (1991), "Firm resources and sustained competitive advantage",</w:t>
+        <w:t xml:space="preserve">, Vol. 50 No. 8, pp.1372-1387, https://doi.org/10.1057/s41267-019-00243-7</w:t>
+      </w:r>
+    </w:p>
+    <w:p>
+      <w:pPr>
+        <w:pStyle w:val="BodyText"/>
+      </w:pPr>
+      <w:r>
+        <w:t xml:space="preserve">Barney, J. (1991),</w:t>
+      </w:r>
+      <w:r>
+        <w:t xml:space="preserve"> </w:t>
+      </w:r>
+      <w:r>
+        <w:t xml:space="preserve">“</w:t>
+      </w:r>
+      <w:r>
+        <w:t xml:space="preserve">Firm resources and sustained competitive advantage</w:t>
+      </w:r>
+      <w:r>
+        <w:t xml:space="preserve">”</w:t>
+      </w:r>
+      <w:r>
+        <w:t xml:space="preserve">,</w:t>
       </w:r>
       <w:r>
         <w:t xml:space="preserve"> </w:t>
@@ -1658,26 +1731,30 @@
         <w:t xml:space="preserve">Journal of Management</w:t>
       </w:r>
       <w:r>
-        <w:t xml:space="preserve">, Vol. 17 No. 1, pp.99-120,</w:t>
-      </w:r>
-      <w:r>
-        <w:t xml:space="preserve"> </w:t>
-      </w:r>
-      <w:hyperlink r:id="rId58">
-        <w:r>
-          <w:rPr>
-            <w:rStyle w:val="Hyperlink"/>
-          </w:rPr>
-          <w:t xml:space="preserve">https://doi.org/10.1177/014920639101700108</w:t>
-        </w:r>
-      </w:hyperlink>
-    </w:p>
-    <w:p>
-      <w:pPr>
-        <w:pStyle w:val="BodyText"/>
-      </w:pPr>
-      <w:r>
-        <w:t xml:space="preserve">Bernard, A.B., Jensen, J.B., Redding, S.J. and Schott, P.K. (2007), "Firms in international trade",</w:t>
+        <w:t xml:space="preserve">, Vol. 17 No. 1, pp.99-120, https://doi.org/10.1177/014920639101700108</w:t>
+      </w:r>
+    </w:p>
+    <w:p>
+      <w:pPr>
+        <w:pStyle w:val="BodyText"/>
+      </w:pPr>
+      <w:r>
+        <w:t xml:space="preserve">Bernard, A.B., Jensen, J.B., Redding, S.J. and Schott, P.K. (2007),</w:t>
+      </w:r>
+      <w:r>
+        <w:t xml:space="preserve"> </w:t>
+      </w:r>
+      <w:r>
+        <w:t xml:space="preserve">“</w:t>
+      </w:r>
+      <w:r>
+        <w:t xml:space="preserve">Firms in international trade</w:t>
+      </w:r>
+      <w:r>
+        <w:t xml:space="preserve">”</w:t>
+      </w:r>
+      <w:r>
+        <w:t xml:space="preserve">,</w:t>
       </w:r>
       <w:r>
         <w:t xml:space="preserve"> </w:t>
@@ -1690,26 +1767,30 @@
         <w:t xml:space="preserve">Journal of Economic Perspectives</w:t>
       </w:r>
       <w:r>
-        <w:t xml:space="preserve">, Vol. 21 No. 3, pp.105-130,</w:t>
-      </w:r>
-      <w:r>
-        <w:t xml:space="preserve"> </w:t>
-      </w:r>
-      <w:hyperlink r:id="rId59">
-        <w:r>
-          <w:rPr>
-            <w:rStyle w:val="Hyperlink"/>
-          </w:rPr>
-          <w:t xml:space="preserve">https://doi.org/10.1257/jep.21.3.105</w:t>
-        </w:r>
-      </w:hyperlink>
-    </w:p>
-    <w:p>
-      <w:pPr>
-        <w:pStyle w:val="BodyText"/>
-      </w:pPr>
-      <w:r>
-        <w:t xml:space="preserve">Bharadwaj, A., El Sawy, O.A., Pavlou, P.A. and Venkatraman, N. (2013), "Digital business strategy: toward a next generation of insights",</w:t>
+        <w:t xml:space="preserve">, Vol. 21 No. 3, pp.105-130, https://doi.org/10.1257/jep.21.3.105</w:t>
+      </w:r>
+    </w:p>
+    <w:p>
+      <w:pPr>
+        <w:pStyle w:val="BodyText"/>
+      </w:pPr>
+      <w:r>
+        <w:t xml:space="preserve">Bharadwaj, A., El Sawy, O.A., Pavlou, P.A. and Venkatraman, N. (2013),</w:t>
+      </w:r>
+      <w:r>
+        <w:t xml:space="preserve"> </w:t>
+      </w:r>
+      <w:r>
+        <w:t xml:space="preserve">“</w:t>
+      </w:r>
+      <w:r>
+        <w:t xml:space="preserve">Digital business strategy: toward a next generation of insights</w:t>
+      </w:r>
+      <w:r>
+        <w:t xml:space="preserve">”</w:t>
+      </w:r>
+      <w:r>
+        <w:t xml:space="preserve">,</w:t>
       </w:r>
       <w:r>
         <w:t xml:space="preserve"> </w:t>
@@ -1722,26 +1803,30 @@
         <w:t xml:space="preserve">MIS Quarterly</w:t>
       </w:r>
       <w:r>
-        <w:t xml:space="preserve">, Vol. 37 No. 2, pp.471-482,</w:t>
-      </w:r>
-      <w:r>
-        <w:t xml:space="preserve"> </w:t>
-      </w:r>
-      <w:hyperlink r:id="rId60">
-        <w:r>
-          <w:rPr>
-            <w:rStyle w:val="Hyperlink"/>
-          </w:rPr>
-          <w:t xml:space="preserve">https://doi.org/10.25300/misq/2013/37:2.3</w:t>
-        </w:r>
-      </w:hyperlink>
-    </w:p>
-    <w:p>
-      <w:pPr>
-        <w:pStyle w:val="BodyText"/>
-      </w:pPr>
-      <w:r>
-        <w:t xml:space="preserve">Brouthers, K.D., Geisser, K.D. and Rothlauf, F. (2016), "Explaining the internationalization of iBusiness firms",</w:t>
+        <w:t xml:space="preserve">, Vol. 37 No. 2, pp.471-482, https://doi.org/10.25300/misq/2013/37:2.3</w:t>
+      </w:r>
+    </w:p>
+    <w:p>
+      <w:pPr>
+        <w:pStyle w:val="BodyText"/>
+      </w:pPr>
+      <w:r>
+        <w:t xml:space="preserve">Brouthers, K.D., Geisser, K.D. and Rothlauf, F. (2016),</w:t>
+      </w:r>
+      <w:r>
+        <w:t xml:space="preserve"> </w:t>
+      </w:r>
+      <w:r>
+        <w:t xml:space="preserve">“</w:t>
+      </w:r>
+      <w:r>
+        <w:t xml:space="preserve">Explaining the internationalization of iBusiness firms</w:t>
+      </w:r>
+      <w:r>
+        <w:t xml:space="preserve">”</w:t>
+      </w:r>
+      <w:r>
+        <w:t xml:space="preserve">,</w:t>
       </w:r>
       <w:r>
         <w:t xml:space="preserve"> </w:t>
@@ -1754,26 +1839,30 @@
         <w:t xml:space="preserve">Journal of International Business Studies</w:t>
       </w:r>
       <w:r>
-        <w:t xml:space="preserve">, Vol. 47 No. 5, pp.513-534,</w:t>
-      </w:r>
-      <w:r>
-        <w:t xml:space="preserve"> </w:t>
-      </w:r>
-      <w:hyperlink r:id="rId61">
-        <w:r>
-          <w:rPr>
-            <w:rStyle w:val="Hyperlink"/>
-          </w:rPr>
-          <w:t xml:space="preserve">https://doi.org/10.1057/jibs.2015.20</w:t>
-        </w:r>
-      </w:hyperlink>
-    </w:p>
-    <w:p>
-      <w:pPr>
-        <w:pStyle w:val="BodyText"/>
-      </w:pPr>
-      <w:r>
-        <w:t xml:space="preserve">Brynjolfsson, E., Rock, D. and Syverson, C. (2021), "The productivity J-curve: how intangibles complement general purpose technologies",</w:t>
+        <w:t xml:space="preserve">, Vol. 47 No. 5, pp.513-534, https://doi.org/10.1057/jibs.2015.20</w:t>
+      </w:r>
+    </w:p>
+    <w:p>
+      <w:pPr>
+        <w:pStyle w:val="BodyText"/>
+      </w:pPr>
+      <w:r>
+        <w:t xml:space="preserve">Brynjolfsson, E., Rock, D. and Syverson, C. (2021),</w:t>
+      </w:r>
+      <w:r>
+        <w:t xml:space="preserve"> </w:t>
+      </w:r>
+      <w:r>
+        <w:t xml:space="preserve">“</w:t>
+      </w:r>
+      <w:r>
+        <w:t xml:space="preserve">The productivity J-curve: how intangibles complement general purpose technologies</w:t>
+      </w:r>
+      <w:r>
+        <w:t xml:space="preserve">”</w:t>
+      </w:r>
+      <w:r>
+        <w:t xml:space="preserve">,</w:t>
       </w:r>
       <w:r>
         <w:t xml:space="preserve"> </w:t>
@@ -1786,26 +1875,30 @@
         <w:t xml:space="preserve">American Economic Journal: Macroeconomics</w:t>
       </w:r>
       <w:r>
-        <w:t xml:space="preserve">, Vol. 13 No. 1, pp.333-372,</w:t>
-      </w:r>
-      <w:r>
-        <w:t xml:space="preserve"> </w:t>
-      </w:r>
-      <w:hyperlink r:id="rId62">
-        <w:r>
-          <w:rPr>
-            <w:rStyle w:val="Hyperlink"/>
-          </w:rPr>
-          <w:t xml:space="preserve">https://doi.org/10.1257/mac.20180386</w:t>
-        </w:r>
-      </w:hyperlink>
-    </w:p>
-    <w:p>
-      <w:pPr>
-        <w:pStyle w:val="BodyText"/>
-      </w:pPr>
-      <w:r>
-        <w:t xml:space="preserve">Certo, S.T., Busenbark, J.R., Woo, H.-S. and Semadeni, M. (2016), "Sample selection bias and Heckman models in strategic management research",</w:t>
+        <w:t xml:space="preserve">, Vol. 13 No. 1, pp.333-372, https://doi.org/10.1257/mac.20180386</w:t>
+      </w:r>
+    </w:p>
+    <w:p>
+      <w:pPr>
+        <w:pStyle w:val="BodyText"/>
+      </w:pPr>
+      <w:r>
+        <w:t xml:space="preserve">Certo, S.T., Busenbark, J.R., Woo, H.-S. and Semadeni, M. (2016),</w:t>
+      </w:r>
+      <w:r>
+        <w:t xml:space="preserve"> </w:t>
+      </w:r>
+      <w:r>
+        <w:t xml:space="preserve">“</w:t>
+      </w:r>
+      <w:r>
+        <w:t xml:space="preserve">Sample selection bias and Heckman models in strategic management research</w:t>
+      </w:r>
+      <w:r>
+        <w:t xml:space="preserve">”</w:t>
+      </w:r>
+      <w:r>
+        <w:t xml:space="preserve">,</w:t>
       </w:r>
       <w:r>
         <w:t xml:space="preserve"> </w:t>
@@ -1818,26 +1911,30 @@
         <w:t xml:space="preserve">Strategic Management Journal</w:t>
       </w:r>
       <w:r>
-        <w:t xml:space="preserve">, Vol. 37 No. 13, pp.2639-2657,</w:t>
-      </w:r>
-      <w:r>
-        <w:t xml:space="preserve"> </w:t>
-      </w:r>
-      <w:hyperlink r:id="rId63">
-        <w:r>
-          <w:rPr>
-            <w:rStyle w:val="Hyperlink"/>
-          </w:rPr>
-          <w:t xml:space="preserve">https://doi.org/10.1002/smj.2475</w:t>
-        </w:r>
-      </w:hyperlink>
-    </w:p>
-    <w:p>
-      <w:pPr>
-        <w:pStyle w:val="BodyText"/>
-      </w:pPr>
-      <w:r>
-        <w:t xml:space="preserve">Cohen, W.M. and Levinthal, D.A. (1990), "Absorptive capacity: a new perspective on learning and innovation",</w:t>
+        <w:t xml:space="preserve">, Vol. 37 No. 13, pp.2639-2657, https://doi.org/10.1002/smj.2475</w:t>
+      </w:r>
+    </w:p>
+    <w:p>
+      <w:pPr>
+        <w:pStyle w:val="BodyText"/>
+      </w:pPr>
+      <w:r>
+        <w:t xml:space="preserve">Cohen, W.M. and Levinthal, D.A. (1990),</w:t>
+      </w:r>
+      <w:r>
+        <w:t xml:space="preserve"> </w:t>
+      </w:r>
+      <w:r>
+        <w:t xml:space="preserve">“</w:t>
+      </w:r>
+      <w:r>
+        <w:t xml:space="preserve">Absorptive capacity: a new perspective on learning and innovation</w:t>
+      </w:r>
+      <w:r>
+        <w:t xml:space="preserve">”</w:t>
+      </w:r>
+      <w:r>
+        <w:t xml:space="preserve">,</w:t>
       </w:r>
       <w:r>
         <w:t xml:space="preserve"> </w:t>
@@ -1850,26 +1947,30 @@
         <w:t xml:space="preserve">Administrative Science Quarterly</w:t>
       </w:r>
       <w:r>
-        <w:t xml:space="preserve">, Vol. 35 No. 1, pp.128-152,</w:t>
-      </w:r>
-      <w:r>
-        <w:t xml:space="preserve"> </w:t>
-      </w:r>
-      <w:hyperlink r:id="rId64">
-        <w:r>
-          <w:rPr>
-            <w:rStyle w:val="Hyperlink"/>
-          </w:rPr>
-          <w:t xml:space="preserve">https://doi.org/10.2307/2393553</w:t>
-        </w:r>
-      </w:hyperlink>
-    </w:p>
-    <w:p>
-      <w:pPr>
-        <w:pStyle w:val="BodyText"/>
-      </w:pPr>
-      <w:r>
-        <w:t xml:space="preserve">Contractor, F.J. (2007), "Is international business good for companies? The evolutionary or multi-stage theory of internationalization vs. the transaction cost perspective",</w:t>
+        <w:t xml:space="preserve">, Vol. 35 No. 1, pp.128-152, https://doi.org/10.2307/2393553</w:t>
+      </w:r>
+    </w:p>
+    <w:p>
+      <w:pPr>
+        <w:pStyle w:val="BodyText"/>
+      </w:pPr>
+      <w:r>
+        <w:t xml:space="preserve">Contractor, F.J. (2007),</w:t>
+      </w:r>
+      <w:r>
+        <w:t xml:space="preserve"> </w:t>
+      </w:r>
+      <w:r>
+        <w:t xml:space="preserve">“</w:t>
+      </w:r>
+      <w:r>
+        <w:t xml:space="preserve">Is international business good for companies? The evolutionary or multi-stage theory of internationalization vs. the transaction cost perspective</w:t>
+      </w:r>
+      <w:r>
+        <w:t xml:space="preserve">”</w:t>
+      </w:r>
+      <w:r>
+        <w:t xml:space="preserve">,</w:t>
       </w:r>
       <w:r>
         <w:t xml:space="preserve"> </w:t>
@@ -1882,26 +1983,30 @@
         <w:t xml:space="preserve">Management International Review</w:t>
       </w:r>
       <w:r>
-        <w:t xml:space="preserve">, Vol. 47 No. 3, pp.453-475,</w:t>
-      </w:r>
-      <w:r>
-        <w:t xml:space="preserve"> </w:t>
-      </w:r>
-      <w:hyperlink r:id="rId65">
-        <w:r>
-          <w:rPr>
-            <w:rStyle w:val="Hyperlink"/>
-          </w:rPr>
-          <w:t xml:space="preserve">https://doi.org/10.1007/s11575-007-0024-2</w:t>
-        </w:r>
-      </w:hyperlink>
-    </w:p>
-    <w:p>
-      <w:pPr>
-        <w:pStyle w:val="BodyText"/>
-      </w:pPr>
-      <w:r>
-        <w:t xml:space="preserve">Coviello, N., Kano, L. and Liesch, P.W. (2017), "Adapting the Uppsala model to a modern world: macro-context and microfoundations",</w:t>
+        <w:t xml:space="preserve">, Vol. 47 No. 3, pp.453-475, https://doi.org/10.1007/s11575-007-0024-2</w:t>
+      </w:r>
+    </w:p>
+    <w:p>
+      <w:pPr>
+        <w:pStyle w:val="BodyText"/>
+      </w:pPr>
+      <w:r>
+        <w:t xml:space="preserve">Coviello, N., Kano, L. and Liesch, P.W. (2017),</w:t>
+      </w:r>
+      <w:r>
+        <w:t xml:space="preserve"> </w:t>
+      </w:r>
+      <w:r>
+        <w:t xml:space="preserve">“</w:t>
+      </w:r>
+      <w:r>
+        <w:t xml:space="preserve">Adapting the Uppsala model to a modern world: macro-context and microfoundations</w:t>
+      </w:r>
+      <w:r>
+        <w:t xml:space="preserve">”</w:t>
+      </w:r>
+      <w:r>
+        <w:t xml:space="preserve">,</w:t>
       </w:r>
       <w:r>
         <w:t xml:space="preserve"> </w:t>
@@ -1914,26 +2019,30 @@
         <w:t xml:space="preserve">Journal of International Business Studies</w:t>
       </w:r>
       <w:r>
-        <w:t xml:space="preserve">, Vol. 48 No. 9, pp.1151-1164,</w:t>
-      </w:r>
-      <w:r>
-        <w:t xml:space="preserve"> </w:t>
-      </w:r>
-      <w:hyperlink r:id="rId66">
-        <w:r>
-          <w:rPr>
-            <w:rStyle w:val="Hyperlink"/>
-          </w:rPr>
-          <w:t xml:space="preserve">https://doi.org/10.1057/s41267-017-0120-x</w:t>
-        </w:r>
-      </w:hyperlink>
-    </w:p>
-    <w:p>
-      <w:pPr>
-        <w:pStyle w:val="BodyText"/>
-      </w:pPr>
-      <w:r>
-        <w:t xml:space="preserve">Cuervo-Cazurra, A. and Genc, M. (2008), "Transforming disadvantages into advantages: developing-country MNEs in the least developed countries",</w:t>
+        <w:t xml:space="preserve">, Vol. 48 No. 9, pp.1151-1164, https://doi.org/10.1057/s41267-017-0120-x</w:t>
+      </w:r>
+    </w:p>
+    <w:p>
+      <w:pPr>
+        <w:pStyle w:val="BodyText"/>
+      </w:pPr>
+      <w:r>
+        <w:t xml:space="preserve">Cuervo-Cazurra, A. and Genc, M. (2008),</w:t>
+      </w:r>
+      <w:r>
+        <w:t xml:space="preserve"> </w:t>
+      </w:r>
+      <w:r>
+        <w:t xml:space="preserve">“</w:t>
+      </w:r>
+      <w:r>
+        <w:t xml:space="preserve">Transforming disadvantages into advantages: developing-country MNEs in the least developed countries</w:t>
+      </w:r>
+      <w:r>
+        <w:t xml:space="preserve">”</w:t>
+      </w:r>
+      <w:r>
+        <w:t xml:space="preserve">,</w:t>
       </w:r>
       <w:r>
         <w:t xml:space="preserve"> </w:t>
@@ -1946,26 +2055,30 @@
         <w:t xml:space="preserve">Journal of International Business Studies</w:t>
       </w:r>
       <w:r>
-        <w:t xml:space="preserve">, Vol. 39 No. 6, pp.957-979,</w:t>
-      </w:r>
-      <w:r>
-        <w:t xml:space="preserve"> </w:t>
-      </w:r>
-      <w:hyperlink r:id="rId67">
-        <w:r>
-          <w:rPr>
-            <w:rStyle w:val="Hyperlink"/>
-          </w:rPr>
-          <w:t xml:space="preserve">https://doi.org/10.1057/palgrave.jibs.8400390</w:t>
-        </w:r>
-      </w:hyperlink>
-    </w:p>
-    <w:p>
-      <w:pPr>
-        <w:pStyle w:val="BodyText"/>
-      </w:pPr>
-      <w:r>
-        <w:t xml:space="preserve">Eisenhardt, K.M. and Martin, J.A. (2000), "Dynamic capabilities: what are they?",</w:t>
+        <w:t xml:space="preserve">, Vol. 39 No. 6, pp.957-979, https://doi.org/10.1057/palgrave.jibs.8400390</w:t>
+      </w:r>
+    </w:p>
+    <w:p>
+      <w:pPr>
+        <w:pStyle w:val="BodyText"/>
+      </w:pPr>
+      <w:r>
+        <w:t xml:space="preserve">Eisenhardt, K.M. and Martin, J.A. (2000),</w:t>
+      </w:r>
+      <w:r>
+        <w:t xml:space="preserve"> </w:t>
+      </w:r>
+      <w:r>
+        <w:t xml:space="preserve">“</w:t>
+      </w:r>
+      <w:r>
+        <w:t xml:space="preserve">Dynamic capabilities: what are they?</w:t>
+      </w:r>
+      <w:r>
+        <w:t xml:space="preserve">”</w:t>
+      </w:r>
+      <w:r>
+        <w:t xml:space="preserve">,</w:t>
       </w:r>
       <w:r>
         <w:t xml:space="preserve"> </w:t>
@@ -1978,29 +2091,30 @@
         <w:t xml:space="preserve">Strategic Management Journal</w:t>
       </w:r>
       <w:r>
-        <w:t xml:space="preserve">, Vol. 21 No. 10-11, pp.1105-1121,</w:t>
-      </w:r>
-      <w:r>
-        <w:t xml:space="preserve"> </w:t>
-      </w:r>
-      <w:hyperlink r:id="rId68">
-        <w:r>
-          <w:rPr>
-            <w:rStyle w:val="Hyperlink"/>
-          </w:rPr>
-          <w:t xml:space="preserve">https://doi.org/10.1002/1097-0266(200010/11)21:10/11</w:t>
-        </w:r>
-      </w:hyperlink>
-      <w:r>
-        <w:t xml:space="preserve">&lt;1105::AID-SMJ133&gt;3.0.CO;2-E</w:t>
-      </w:r>
-    </w:p>
-    <w:p>
-      <w:pPr>
-        <w:pStyle w:val="BodyText"/>
-      </w:pPr>
-      <w:r>
-        <w:t xml:space="preserve">Goldfarb, A. and Tucker, C. (2019), "Digital economics",</w:t>
+        <w:t xml:space="preserve">, Vol. 21 No. 10-11, pp.1105-1121, https://doi.org/10.1002/1097-0266(200010/11)21:10/11&lt;1105::AID-SMJ133&gt;3.0.CO;2-E</w:t>
+      </w:r>
+    </w:p>
+    <w:p>
+      <w:pPr>
+        <w:pStyle w:val="BodyText"/>
+      </w:pPr>
+      <w:r>
+        <w:t xml:space="preserve">Goldfarb, A. and Tucker, C. (2019),</w:t>
+      </w:r>
+      <w:r>
+        <w:t xml:space="preserve"> </w:t>
+      </w:r>
+      <w:r>
+        <w:t xml:space="preserve">“</w:t>
+      </w:r>
+      <w:r>
+        <w:t xml:space="preserve">Digital economics</w:t>
+      </w:r>
+      <w:r>
+        <w:t xml:space="preserve">”</w:t>
+      </w:r>
+      <w:r>
+        <w:t xml:space="preserve">,</w:t>
       </w:r>
       <w:r>
         <w:t xml:space="preserve"> </w:t>
@@ -2013,26 +2127,30 @@
         <w:t xml:space="preserve">Journal of Economic Literature</w:t>
       </w:r>
       <w:r>
-        <w:t xml:space="preserve">, Vol. 57 No. 1, pp.3-43,</w:t>
-      </w:r>
-      <w:r>
-        <w:t xml:space="preserve"> </w:t>
-      </w:r>
-      <w:hyperlink r:id="rId69">
-        <w:r>
-          <w:rPr>
-            <w:rStyle w:val="Hyperlink"/>
-          </w:rPr>
-          <w:t xml:space="preserve">https://doi.org/10.1257/jel.20171452</w:t>
-        </w:r>
-      </w:hyperlink>
-    </w:p>
-    <w:p>
-      <w:pPr>
-        <w:pStyle w:val="BodyText"/>
-      </w:pPr>
-      <w:r>
-        <w:t xml:space="preserve">Haans, R.F.J., Pieters, C. and He, Z.-L. (2016), "Thinking about U: theorizing and testing U- and inverted U-shaped relationships in strategy research",</w:t>
+        <w:t xml:space="preserve">, Vol. 57 No. 1, pp.3-43, https://doi.org/10.1257/jel.20171452</w:t>
+      </w:r>
+    </w:p>
+    <w:p>
+      <w:pPr>
+        <w:pStyle w:val="BodyText"/>
+      </w:pPr>
+      <w:r>
+        <w:t xml:space="preserve">Haans, R.F.J., Pieters, C. and He, Z.-L. (2016),</w:t>
+      </w:r>
+      <w:r>
+        <w:t xml:space="preserve"> </w:t>
+      </w:r>
+      <w:r>
+        <w:t xml:space="preserve">“</w:t>
+      </w:r>
+      <w:r>
+        <w:t xml:space="preserve">Thinking about U: theorizing and testing U- and inverted U-shaped relationships in strategy research</w:t>
+      </w:r>
+      <w:r>
+        <w:t xml:space="preserve">”</w:t>
+      </w:r>
+      <w:r>
+        <w:t xml:space="preserve">,</w:t>
       </w:r>
       <w:r>
         <w:t xml:space="preserve"> </w:t>
@@ -2045,26 +2163,30 @@
         <w:t xml:space="preserve">Strategic Management Journal</w:t>
       </w:r>
       <w:r>
-        <w:t xml:space="preserve">, Vol. 37 No. 7, pp.1177-1195,</w:t>
-      </w:r>
-      <w:r>
-        <w:t xml:space="preserve"> </w:t>
-      </w:r>
-      <w:hyperlink r:id="rId70">
-        <w:r>
-          <w:rPr>
-            <w:rStyle w:val="Hyperlink"/>
-          </w:rPr>
-          <w:t xml:space="preserve">https://doi.org/10.1002/smj.2399</w:t>
-        </w:r>
-      </w:hyperlink>
-    </w:p>
-    <w:p>
-      <w:pPr>
-        <w:pStyle w:val="BodyText"/>
-      </w:pPr>
-      <w:r>
-        <w:t xml:space="preserve">Hanelt, A., Bohnsack, R., Marz, D. and Antunes Marante, C. (2021), "A systematic review of the literature on digital transformation: insights and implications for strategy and organizational change",</w:t>
+        <w:t xml:space="preserve">, Vol. 37 No. 7, pp.1177-1195, https://doi.org/10.1002/smj.2399</w:t>
+      </w:r>
+    </w:p>
+    <w:p>
+      <w:pPr>
+        <w:pStyle w:val="BodyText"/>
+      </w:pPr>
+      <w:r>
+        <w:t xml:space="preserve">Hanelt, A., Bohnsack, R., Marz, D. and Antunes Marante, C. (2021),</w:t>
+      </w:r>
+      <w:r>
+        <w:t xml:space="preserve"> </w:t>
+      </w:r>
+      <w:r>
+        <w:t xml:space="preserve">“</w:t>
+      </w:r>
+      <w:r>
+        <w:t xml:space="preserve">A systematic review of the literature on digital transformation: insights and implications for strategy and organizational change</w:t>
+      </w:r>
+      <w:r>
+        <w:t xml:space="preserve">”</w:t>
+      </w:r>
+      <w:r>
+        <w:t xml:space="preserve">,</w:t>
       </w:r>
       <w:r>
         <w:t xml:space="preserve"> </w:t>
@@ -2077,26 +2199,30 @@
         <w:t xml:space="preserve">Journal of Management Studies</w:t>
       </w:r>
       <w:r>
-        <w:t xml:space="preserve">, Vol. 58 No. 5, pp.1159-1197,</w:t>
-      </w:r>
-      <w:r>
-        <w:t xml:space="preserve"> </w:t>
-      </w:r>
-      <w:hyperlink r:id="rId71">
-        <w:r>
-          <w:rPr>
-            <w:rStyle w:val="Hyperlink"/>
-          </w:rPr>
-          <w:t xml:space="preserve">https://doi.org/10.1111/joms.12639</w:t>
-        </w:r>
-      </w:hyperlink>
-    </w:p>
-    <w:p>
-      <w:pPr>
-        <w:pStyle w:val="BodyText"/>
-      </w:pPr>
-      <w:r>
-        <w:t xml:space="preserve">Heckman, J.J. (1979), "Sample selection bias as a specification error",</w:t>
+        <w:t xml:space="preserve">, Vol. 58 No. 5, pp.1159-1197, https://doi.org/10.1111/joms.12639</w:t>
+      </w:r>
+    </w:p>
+    <w:p>
+      <w:pPr>
+        <w:pStyle w:val="BodyText"/>
+      </w:pPr>
+      <w:r>
+        <w:t xml:space="preserve">Heckman, J.J. (1979),</w:t>
+      </w:r>
+      <w:r>
+        <w:t xml:space="preserve"> </w:t>
+      </w:r>
+      <w:r>
+        <w:t xml:space="preserve">“</w:t>
+      </w:r>
+      <w:r>
+        <w:t xml:space="preserve">Sample selection bias as a specification error</w:t>
+      </w:r>
+      <w:r>
+        <w:t xml:space="preserve">”</w:t>
+      </w:r>
+      <w:r>
+        <w:t xml:space="preserve">,</w:t>
       </w:r>
       <w:r>
         <w:t xml:space="preserve"> </w:t>
@@ -2109,26 +2235,30 @@
         <w:t xml:space="preserve">Econometrica</w:t>
       </w:r>
       <w:r>
-        <w:t xml:space="preserve">, Vol. 47 No. 1, pp.153-161,</w:t>
-      </w:r>
-      <w:r>
-        <w:t xml:space="preserve"> </w:t>
-      </w:r>
-      <w:hyperlink r:id="rId72">
-        <w:r>
-          <w:rPr>
-            <w:rStyle w:val="Hyperlink"/>
-          </w:rPr>
-          <w:t xml:space="preserve">https://doi.org/10.2307/1912352</w:t>
-        </w:r>
-      </w:hyperlink>
-    </w:p>
-    <w:p>
-      <w:pPr>
-        <w:pStyle w:val="BodyText"/>
-      </w:pPr>
-      <w:r>
-        <w:t xml:space="preserve">Hennart, J.-F. (2007), "The theoretical rationale for a multinationality-performance relationship",</w:t>
+        <w:t xml:space="preserve">, Vol. 47 No. 1, pp.153-161, https://doi.org/10.2307/1912352</w:t>
+      </w:r>
+    </w:p>
+    <w:p>
+      <w:pPr>
+        <w:pStyle w:val="BodyText"/>
+      </w:pPr>
+      <w:r>
+        <w:t xml:space="preserve">Hennart, J.-F. (2007),</w:t>
+      </w:r>
+      <w:r>
+        <w:t xml:space="preserve"> </w:t>
+      </w:r>
+      <w:r>
+        <w:t xml:space="preserve">“</w:t>
+      </w:r>
+      <w:r>
+        <w:t xml:space="preserve">The theoretical rationale for a multinationality-performance relationship</w:t>
+      </w:r>
+      <w:r>
+        <w:t xml:space="preserve">”</w:t>
+      </w:r>
+      <w:r>
+        <w:t xml:space="preserve">,</w:t>
       </w:r>
       <w:r>
         <w:t xml:space="preserve"> </w:t>
@@ -2141,26 +2271,30 @@
         <w:t xml:space="preserve">Management International Review</w:t>
       </w:r>
       <w:r>
-        <w:t xml:space="preserve">, Vol. 47 No. 3, pp.423-452,</w:t>
-      </w:r>
-      <w:r>
-        <w:t xml:space="preserve"> </w:t>
-      </w:r>
-      <w:hyperlink r:id="rId73">
-        <w:r>
-          <w:rPr>
-            <w:rStyle w:val="Hyperlink"/>
-          </w:rPr>
-          <w:t xml:space="preserve">https://doi.org/10.1007/s11575-007-0023-3</w:t>
-        </w:r>
-      </w:hyperlink>
-    </w:p>
-    <w:p>
-      <w:pPr>
-        <w:pStyle w:val="BodyText"/>
-      </w:pPr>
-      <w:r>
-        <w:t xml:space="preserve">Hennart, J.-F. (2011), "A theoretical assessment of the empirical literature on the impact of multinationality on performance",</w:t>
+        <w:t xml:space="preserve">, Vol. 47 No. 3, pp.423-452, https://doi.org/10.1007/s11575-007-0023-3</w:t>
+      </w:r>
+    </w:p>
+    <w:p>
+      <w:pPr>
+        <w:pStyle w:val="BodyText"/>
+      </w:pPr>
+      <w:r>
+        <w:t xml:space="preserve">Hennart, J.-F. (2011),</w:t>
+      </w:r>
+      <w:r>
+        <w:t xml:space="preserve"> </w:t>
+      </w:r>
+      <w:r>
+        <w:t xml:space="preserve">“</w:t>
+      </w:r>
+      <w:r>
+        <w:t xml:space="preserve">A theoretical assessment of the empirical literature on the impact of multinationality on performance</w:t>
+      </w:r>
+      <w:r>
+        <w:t xml:space="preserve">”</w:t>
+      </w:r>
+      <w:r>
+        <w:t xml:space="preserve">,</w:t>
       </w:r>
       <w:r>
         <w:t xml:space="preserve"> </w:t>
@@ -2173,26 +2307,30 @@
         <w:t xml:space="preserve">Global Strategy Journal</w:t>
       </w:r>
       <w:r>
-        <w:t xml:space="preserve">, Vol. 1 No. 1-2, pp.135-151,</w:t>
-      </w:r>
-      <w:r>
-        <w:t xml:space="preserve"> </w:t>
-      </w:r>
-      <w:hyperlink r:id="rId74">
-        <w:r>
-          <w:rPr>
-            <w:rStyle w:val="Hyperlink"/>
-          </w:rPr>
-          <w:t xml:space="preserve">https://doi.org/10.1002/gsj.8</w:t>
-        </w:r>
-      </w:hyperlink>
-    </w:p>
-    <w:p>
-      <w:pPr>
-        <w:pStyle w:val="BodyText"/>
-      </w:pPr>
-      <w:r>
-        <w:t xml:space="preserve">Hitt, M.A., Hoskisson, R.E. and Kim, H. (1997), "International diversification: effects on innovation and firm performance in product-diversified firms",</w:t>
+        <w:t xml:space="preserve">, Vol. 1 No. 1-2, pp.135-151, https://doi.org/10.1002/gsj.8</w:t>
+      </w:r>
+    </w:p>
+    <w:p>
+      <w:pPr>
+        <w:pStyle w:val="BodyText"/>
+      </w:pPr>
+      <w:r>
+        <w:t xml:space="preserve">Hitt, M.A., Hoskisson, R.E. and Kim, H. (1997),</w:t>
+      </w:r>
+      <w:r>
+        <w:t xml:space="preserve"> </w:t>
+      </w:r>
+      <w:r>
+        <w:t xml:space="preserve">“</w:t>
+      </w:r>
+      <w:r>
+        <w:t xml:space="preserve">International diversification: effects on innovation and firm performance in product-diversified firms</w:t>
+      </w:r>
+      <w:r>
+        <w:t xml:space="preserve">”</w:t>
+      </w:r>
+      <w:r>
+        <w:t xml:space="preserve">,</w:t>
       </w:r>
       <w:r>
         <w:t xml:space="preserve"> </w:t>
@@ -2205,19 +2343,8 @@
         <w:t xml:space="preserve">Academy of Management Journal</w:t>
       </w:r>
       <w:r>
-        <w:t xml:space="preserve">, Vol. 40 No. 4, pp.767-798,</w:t>
-      </w:r>
-      <w:r>
-        <w:t xml:space="preserve"> </w:t>
-      </w:r>
-      <w:hyperlink r:id="rId75">
-        <w:r>
-          <w:rPr>
-            <w:rStyle w:val="Hyperlink"/>
-          </w:rPr>
-          <w:t xml:space="preserve">https://doi.org/10.2307/256948</w:t>
-        </w:r>
-      </w:hyperlink>
+        <w:t xml:space="preserve">, Vol. 40 No. 4, pp.767-798, https://doi.org/10.2307/256948</w:t>
+      </w:r>
     </w:p>
     <w:p>
       <w:pPr>
@@ -2240,32 +2367,30 @@
         <w:t xml:space="preserve"> </w:t>
       </w:r>
       <w:r>
-        <w:t xml:space="preserve">[data set], available at:</w:t>
-      </w:r>
-      <w:r>
-        <w:t xml:space="preserve"> </w:t>
-      </w:r>
-      <w:hyperlink r:id="rId76">
-        <w:r>
-          <w:rPr>
-            <w:rStyle w:val="Hyperlink"/>
-          </w:rPr>
-          <w:t xml:space="preserve">https://www.itu.int/en/ITU-D/Statistics/Pages/publications/wtid.aspx</w:t>
-        </w:r>
-      </w:hyperlink>
-      <w:r>
-        <w:t xml:space="preserve"> </w:t>
-      </w:r>
-      <w:r>
-        <w:t xml:space="preserve">(accessed 9 May 2026).</w:t>
-      </w:r>
-    </w:p>
-    <w:p>
-      <w:pPr>
-        <w:pStyle w:val="BodyText"/>
-      </w:pPr>
-      <w:r>
-        <w:t xml:space="preserve">Johanson, J. and Vahlne, J.-E. (1977), "The internationalization process of the firm: a model of knowledge development and increasing foreign market commitments",</w:t>
+        <w:t xml:space="preserve">[data set], available at: https://www.itu.int/en/ITU-D/Statistics/Pages/publications/wtid.aspx (accessed 9 May 2026).</w:t>
+      </w:r>
+    </w:p>
+    <w:p>
+      <w:pPr>
+        <w:pStyle w:val="BodyText"/>
+      </w:pPr>
+      <w:r>
+        <w:t xml:space="preserve">Johanson, J. and Vahlne, J.-E. (1977),</w:t>
+      </w:r>
+      <w:r>
+        <w:t xml:space="preserve"> </w:t>
+      </w:r>
+      <w:r>
+        <w:t xml:space="preserve">“</w:t>
+      </w:r>
+      <w:r>
+        <w:t xml:space="preserve">The internationalization process of the firm: a model of knowledge development and increasing foreign market commitments</w:t>
+      </w:r>
+      <w:r>
+        <w:t xml:space="preserve">”</w:t>
+      </w:r>
+      <w:r>
+        <w:t xml:space="preserve">,</w:t>
       </w:r>
       <w:r>
         <w:t xml:space="preserve"> </w:t>
@@ -2278,26 +2403,30 @@
         <w:t xml:space="preserve">Journal of International Business Studies</w:t>
       </w:r>
       <w:r>
-        <w:t xml:space="preserve">, Vol. 8 No. 1, pp.23-32,</w:t>
-      </w:r>
-      <w:r>
-        <w:t xml:space="preserve"> </w:t>
-      </w:r>
-      <w:hyperlink r:id="rId77">
-        <w:r>
-          <w:rPr>
-            <w:rStyle w:val="Hyperlink"/>
-          </w:rPr>
-          <w:t xml:space="preserve">https://doi.org/10.1057/palgrave.jibs.8490676</w:t>
-        </w:r>
-      </w:hyperlink>
-    </w:p>
-    <w:p>
-      <w:pPr>
-        <w:pStyle w:val="BodyText"/>
-      </w:pPr>
-      <w:r>
-        <w:t xml:space="preserve">Johanson, J. and Vahlne, J.-E. (2009), "The Uppsala internationalization process model revisited: from liability of foreignness to liability of outsidership",</w:t>
+        <w:t xml:space="preserve">, Vol. 8 No. 1, pp.23-32, https://doi.org/10.1057/palgrave.jibs.8490676</w:t>
+      </w:r>
+    </w:p>
+    <w:p>
+      <w:pPr>
+        <w:pStyle w:val="BodyText"/>
+      </w:pPr>
+      <w:r>
+        <w:t xml:space="preserve">Johanson, J. and Vahlne, J.-E. (2009),</w:t>
+      </w:r>
+      <w:r>
+        <w:t xml:space="preserve"> </w:t>
+      </w:r>
+      <w:r>
+        <w:t xml:space="preserve">“</w:t>
+      </w:r>
+      <w:r>
+        <w:t xml:space="preserve">The Uppsala internationalization process model revisited: from liability of foreignness to liability of outsidership</w:t>
+      </w:r>
+      <w:r>
+        <w:t xml:space="preserve">”</w:t>
+      </w:r>
+      <w:r>
+        <w:t xml:space="preserve">,</w:t>
       </w:r>
       <w:r>
         <w:t xml:space="preserve"> </w:t>
@@ -2310,26 +2439,30 @@
         <w:t xml:space="preserve">Journal of International Business Studies</w:t>
       </w:r>
       <w:r>
-        <w:t xml:space="preserve">, Vol. 40 No. 9, pp.1411-1431,</w:t>
-      </w:r>
-      <w:r>
-        <w:t xml:space="preserve"> </w:t>
-      </w:r>
-      <w:hyperlink r:id="rId78">
-        <w:r>
-          <w:rPr>
-            <w:rStyle w:val="Hyperlink"/>
-          </w:rPr>
-          <w:t xml:space="preserve">https://doi.org/10.1057/jibs.2009.24</w:t>
-        </w:r>
-      </w:hyperlink>
-    </w:p>
-    <w:p>
-      <w:pPr>
-        <w:pStyle w:val="BodyText"/>
-      </w:pPr>
-      <w:r>
-        <w:t xml:space="preserve">Karna, A., Richter, A. and Riesenkampff, E. (2016), "Revisiting the role of the environment in the capabilities-financial performance relationship: a meta-analysis",</w:t>
+        <w:t xml:space="preserve">, Vol. 40 No. 9, pp.1411-1431, https://doi.org/10.1057/jibs.2009.24</w:t>
+      </w:r>
+    </w:p>
+    <w:p>
+      <w:pPr>
+        <w:pStyle w:val="BodyText"/>
+      </w:pPr>
+      <w:r>
+        <w:t xml:space="preserve">Karna, A., Richter, A. and Riesenkampff, E. (2016),</w:t>
+      </w:r>
+      <w:r>
+        <w:t xml:space="preserve"> </w:t>
+      </w:r>
+      <w:r>
+        <w:t xml:space="preserve">“</w:t>
+      </w:r>
+      <w:r>
+        <w:t xml:space="preserve">Revisiting the role of the environment in the capabilities-financial performance relationship: a meta-analysis</w:t>
+      </w:r>
+      <w:r>
+        <w:t xml:space="preserve">”</w:t>
+      </w:r>
+      <w:r>
+        <w:t xml:space="preserve">,</w:t>
       </w:r>
       <w:r>
         <w:t xml:space="preserve"> </w:t>
@@ -2342,26 +2475,30 @@
         <w:t xml:space="preserve">Strategic Management Journal</w:t>
       </w:r>
       <w:r>
-        <w:t xml:space="preserve">, Vol. 37 No. 6, pp.1154-1173,</w:t>
-      </w:r>
-      <w:r>
-        <w:t xml:space="preserve"> </w:t>
-      </w:r>
-      <w:hyperlink r:id="rId79">
-        <w:r>
-          <w:rPr>
-            <w:rStyle w:val="Hyperlink"/>
-          </w:rPr>
-          <w:t xml:space="preserve">https://doi.org/10.1002/smj.2379</w:t>
-        </w:r>
-      </w:hyperlink>
-    </w:p>
-    <w:p>
-      <w:pPr>
-        <w:pStyle w:val="BodyText"/>
-      </w:pPr>
-      <w:r>
-        <w:t xml:space="preserve">Knight, G.A. and Liesch, P.W. (2016), "Internationalization: from incremental to born global",</w:t>
+        <w:t xml:space="preserve">, Vol. 37 No. 6, pp.1154-1173, https://doi.org/10.1002/smj.2379</w:t>
+      </w:r>
+    </w:p>
+    <w:p>
+      <w:pPr>
+        <w:pStyle w:val="BodyText"/>
+      </w:pPr>
+      <w:r>
+        <w:t xml:space="preserve">Knight, G.A. and Liesch, P.W. (2016),</w:t>
+      </w:r>
+      <w:r>
+        <w:t xml:space="preserve"> </w:t>
+      </w:r>
+      <w:r>
+        <w:t xml:space="preserve">“</w:t>
+      </w:r>
+      <w:r>
+        <w:t xml:space="preserve">Internationalization: from incremental to born global</w:t>
+      </w:r>
+      <w:r>
+        <w:t xml:space="preserve">”</w:t>
+      </w:r>
+      <w:r>
+        <w:t xml:space="preserve">,</w:t>
       </w:r>
       <w:r>
         <w:t xml:space="preserve"> </w:t>
@@ -2374,26 +2511,30 @@
         <w:t xml:space="preserve">Journal of World Business</w:t>
       </w:r>
       <w:r>
-        <w:t xml:space="preserve">, Vol. 51 No. 1, pp.93-102,</w:t>
-      </w:r>
-      <w:r>
-        <w:t xml:space="preserve"> </w:t>
-      </w:r>
-      <w:hyperlink r:id="rId80">
-        <w:r>
-          <w:rPr>
-            <w:rStyle w:val="Hyperlink"/>
-          </w:rPr>
-          <w:t xml:space="preserve">https://doi.org/10.1016/j.jwb.2015.08.011</w:t>
-        </w:r>
-      </w:hyperlink>
-    </w:p>
-    <w:p>
-      <w:pPr>
-        <w:pStyle w:val="BodyText"/>
-      </w:pPr>
-      <w:r>
-        <w:t xml:space="preserve">Lall, S. (1992), "Technological capabilities and industrialization",</w:t>
+        <w:t xml:space="preserve">, Vol. 51 No. 1, pp.93-102, https://doi.org/10.1016/j.jwb.2015.08.011</w:t>
+      </w:r>
+    </w:p>
+    <w:p>
+      <w:pPr>
+        <w:pStyle w:val="BodyText"/>
+      </w:pPr>
+      <w:r>
+        <w:t xml:space="preserve">Lall, S. (1992),</w:t>
+      </w:r>
+      <w:r>
+        <w:t xml:space="preserve"> </w:t>
+      </w:r>
+      <w:r>
+        <w:t xml:space="preserve">“</w:t>
+      </w:r>
+      <w:r>
+        <w:t xml:space="preserve">Technological capabilities and industrialization</w:t>
+      </w:r>
+      <w:r>
+        <w:t xml:space="preserve">”</w:t>
+      </w:r>
+      <w:r>
+        <w:t xml:space="preserve">,</w:t>
       </w:r>
       <w:r>
         <w:t xml:space="preserve"> </w:t>
@@ -2406,26 +2547,30 @@
         <w:t xml:space="preserve">World Development</w:t>
       </w:r>
       <w:r>
-        <w:t xml:space="preserve">, Vol. 20 No. 2, pp.165-186,</w:t>
-      </w:r>
-      <w:r>
-        <w:t xml:space="preserve"> </w:t>
-      </w:r>
-      <w:hyperlink r:id="rId81">
-        <w:r>
-          <w:rPr>
-            <w:rStyle w:val="Hyperlink"/>
-          </w:rPr>
-          <w:t xml:space="preserve">https://doi.org/10.1016/0305-750X(92)90097-F</w:t>
-        </w:r>
-      </w:hyperlink>
-    </w:p>
-    <w:p>
-      <w:pPr>
-        <w:pStyle w:val="BodyText"/>
-      </w:pPr>
-      <w:r>
-        <w:t xml:space="preserve">Lind, J.T. and Mehlum, H. (2010), "With or without U? The appropriate test for a U-shaped relationship",</w:t>
+        <w:t xml:space="preserve">, Vol. 20 No. 2, pp.165-186, https://doi.org/10.1016/0305-750X(92)90097-F</w:t>
+      </w:r>
+    </w:p>
+    <w:p>
+      <w:pPr>
+        <w:pStyle w:val="BodyText"/>
+      </w:pPr>
+      <w:r>
+        <w:t xml:space="preserve">Lind, J.T. and Mehlum, H. (2010),</w:t>
+      </w:r>
+      <w:r>
+        <w:t xml:space="preserve"> </w:t>
+      </w:r>
+      <w:r>
+        <w:t xml:space="preserve">“</w:t>
+      </w:r>
+      <w:r>
+        <w:t xml:space="preserve">With or without U? The appropriate test for a U-shaped relationship</w:t>
+      </w:r>
+      <w:r>
+        <w:t xml:space="preserve">”</w:t>
+      </w:r>
+      <w:r>
+        <w:t xml:space="preserve">,</w:t>
       </w:r>
       <w:r>
         <w:t xml:space="preserve"> </w:t>
@@ -2438,26 +2583,30 @@
         <w:t xml:space="preserve">Oxford Bulletin of Economics and Statistics</w:t>
       </w:r>
       <w:r>
-        <w:t xml:space="preserve">, Vol. 72 No. 1, pp.109-118,</w:t>
-      </w:r>
-      <w:r>
-        <w:t xml:space="preserve"> </w:t>
-      </w:r>
-      <w:hyperlink r:id="rId82">
-        <w:r>
-          <w:rPr>
-            <w:rStyle w:val="Hyperlink"/>
-          </w:rPr>
-          <w:t xml:space="preserve">https://doi.org/10.1111/j.1468-0084.2009.00569.x</w:t>
-        </w:r>
-      </w:hyperlink>
-    </w:p>
-    <w:p>
-      <w:pPr>
-        <w:pStyle w:val="BodyText"/>
-      </w:pPr>
-      <w:r>
-        <w:t xml:space="preserve">Lu, J.W. and Beamish, P.W. (2004), "International diversification and firm performance: the S-curve hypothesis",</w:t>
+        <w:t xml:space="preserve">, Vol. 72 No. 1, pp.109-118, https://doi.org/10.1111/j.1468-0084.2009.00569.x</w:t>
+      </w:r>
+    </w:p>
+    <w:p>
+      <w:pPr>
+        <w:pStyle w:val="BodyText"/>
+      </w:pPr>
+      <w:r>
+        <w:t xml:space="preserve">Lu, J.W. and Beamish, P.W. (2004),</w:t>
+      </w:r>
+      <w:r>
+        <w:t xml:space="preserve"> </w:t>
+      </w:r>
+      <w:r>
+        <w:t xml:space="preserve">“</w:t>
+      </w:r>
+      <w:r>
+        <w:t xml:space="preserve">International diversification and firm performance: the S-curve hypothesis</w:t>
+      </w:r>
+      <w:r>
+        <w:t xml:space="preserve">”</w:t>
+      </w:r>
+      <w:r>
+        <w:t xml:space="preserve">,</w:t>
       </w:r>
       <w:r>
         <w:t xml:space="preserve"> </w:t>
@@ -2470,26 +2619,30 @@
         <w:t xml:space="preserve">Academy of Management Journal</w:t>
       </w:r>
       <w:r>
-        <w:t xml:space="preserve">, Vol. 47 No. 4, pp.598-609,</w:t>
-      </w:r>
-      <w:r>
-        <w:t xml:space="preserve"> </w:t>
-      </w:r>
-      <w:hyperlink r:id="rId83">
-        <w:r>
-          <w:rPr>
-            <w:rStyle w:val="Hyperlink"/>
-          </w:rPr>
-          <w:t xml:space="preserve">https://doi.org/10.2307/20159604</w:t>
-        </w:r>
-      </w:hyperlink>
-    </w:p>
-    <w:p>
-      <w:pPr>
-        <w:pStyle w:val="BodyText"/>
-      </w:pPr>
-      <w:r>
-        <w:t xml:space="preserve">Marano, V., Arregle, J.-L., Hitt, M.A., Spadafora, E. and van Essen, M. (2016), "Home country institutions and the internationalization-performance relationship: a meta-analytic review",</w:t>
+        <w:t xml:space="preserve">, Vol. 47 No. 4, pp.598-609, https://doi.org/10.2307/20159604</w:t>
+      </w:r>
+    </w:p>
+    <w:p>
+      <w:pPr>
+        <w:pStyle w:val="BodyText"/>
+      </w:pPr>
+      <w:r>
+        <w:t xml:space="preserve">Marano, V., Arregle, J.-L., Hitt, M.A., Spadafora, E. and van Essen, M. (2016),</w:t>
+      </w:r>
+      <w:r>
+        <w:t xml:space="preserve"> </w:t>
+      </w:r>
+      <w:r>
+        <w:t xml:space="preserve">“</w:t>
+      </w:r>
+      <w:r>
+        <w:t xml:space="preserve">Home country institutions and the internationalization-performance relationship: a meta-analytic review</w:t>
+      </w:r>
+      <w:r>
+        <w:t xml:space="preserve">”</w:t>
+      </w:r>
+      <w:r>
+        <w:t xml:space="preserve">,</w:t>
       </w:r>
       <w:r>
         <w:t xml:space="preserve"> </w:t>
@@ -2502,26 +2655,30 @@
         <w:t xml:space="preserve">Journal of Management</w:t>
       </w:r>
       <w:r>
-        <w:t xml:space="preserve">, Vol. 42 No. 5, pp.1075-1110,</w:t>
-      </w:r>
-      <w:r>
-        <w:t xml:space="preserve"> </w:t>
-      </w:r>
-      <w:hyperlink r:id="rId84">
-        <w:r>
-          <w:rPr>
-            <w:rStyle w:val="Hyperlink"/>
-          </w:rPr>
-          <w:t xml:space="preserve">https://doi.org/10.1177/0149206315624963</w:t>
-        </w:r>
-      </w:hyperlink>
-    </w:p>
-    <w:p>
-      <w:pPr>
-        <w:pStyle w:val="BodyText"/>
-      </w:pPr>
-      <w:r>
-        <w:t xml:space="preserve">Oster, E. (2019), "Unobservable selection and coefficient stability: theory and evidence",</w:t>
+        <w:t xml:space="preserve">, Vol. 42 No. 5, pp.1075-1110, https://doi.org/10.1177/0149206315624963</w:t>
+      </w:r>
+    </w:p>
+    <w:p>
+      <w:pPr>
+        <w:pStyle w:val="BodyText"/>
+      </w:pPr>
+      <w:r>
+        <w:t xml:space="preserve">Oster, E. (2019),</w:t>
+      </w:r>
+      <w:r>
+        <w:t xml:space="preserve"> </w:t>
+      </w:r>
+      <w:r>
+        <w:t xml:space="preserve">“</w:t>
+      </w:r>
+      <w:r>
+        <w:t xml:space="preserve">Unobservable selection and coefficient stability: theory and evidence</w:t>
+      </w:r>
+      <w:r>
+        <w:t xml:space="preserve">”</w:t>
+      </w:r>
+      <w:r>
+        <w:t xml:space="preserve">,</w:t>
       </w:r>
       <w:r>
         <w:t xml:space="preserve"> </w:t>
@@ -2534,26 +2691,30 @@
         <w:t xml:space="preserve">Journal of Business &amp; Economic Statistics</w:t>
       </w:r>
       <w:r>
-        <w:t xml:space="preserve">, Vol. 37 No. 2, pp.187-204,</w:t>
-      </w:r>
-      <w:r>
-        <w:t xml:space="preserve"> </w:t>
-      </w:r>
-      <w:hyperlink r:id="rId85">
-        <w:r>
-          <w:rPr>
-            <w:rStyle w:val="Hyperlink"/>
-          </w:rPr>
-          <w:t xml:space="preserve">https://doi.org/10.1080/07350015.2016.1227711</w:t>
-        </w:r>
-      </w:hyperlink>
-    </w:p>
-    <w:p>
-      <w:pPr>
-        <w:pStyle w:val="BodyText"/>
-      </w:pPr>
-      <w:r>
-        <w:t xml:space="preserve">Paternoster, R., Brame, R., Mazerolle, P. and Piquero, A. (1998), "Using the correct statistical test for the equality of regression coefficients",</w:t>
+        <w:t xml:space="preserve">, Vol. 37 No. 2, pp.187-204, https://doi.org/10.1080/07350015.2016.1227711</w:t>
+      </w:r>
+    </w:p>
+    <w:p>
+      <w:pPr>
+        <w:pStyle w:val="BodyText"/>
+      </w:pPr>
+      <w:r>
+        <w:t xml:space="preserve">Paternoster, R., Brame, R., Mazerolle, P. and Piquero, A. (1998),</w:t>
+      </w:r>
+      <w:r>
+        <w:t xml:space="preserve"> </w:t>
+      </w:r>
+      <w:r>
+        <w:t xml:space="preserve">“</w:t>
+      </w:r>
+      <w:r>
+        <w:t xml:space="preserve">Using the correct statistical test for the equality of regression coefficients</w:t>
+      </w:r>
+      <w:r>
+        <w:t xml:space="preserve">”</w:t>
+      </w:r>
+      <w:r>
+        <w:t xml:space="preserve">,</w:t>
       </w:r>
       <w:r>
         <w:t xml:space="preserve"> </w:t>
@@ -2566,26 +2727,30 @@
         <w:t xml:space="preserve">Criminology</w:t>
       </w:r>
       <w:r>
-        <w:t xml:space="preserve">, Vol. 36 No. 4, pp.859-866,</w:t>
-      </w:r>
-      <w:r>
-        <w:t xml:space="preserve"> </w:t>
-      </w:r>
-      <w:hyperlink r:id="rId86">
-        <w:r>
-          <w:rPr>
-            <w:rStyle w:val="Hyperlink"/>
-          </w:rPr>
-          <w:t xml:space="preserve">https://doi.org/10.1111/j.1745-9125.1998.tb01268.x</w:t>
-        </w:r>
-      </w:hyperlink>
-    </w:p>
-    <w:p>
-      <w:pPr>
-        <w:pStyle w:val="BodyText"/>
-      </w:pPr>
-      <w:r>
-        <w:t xml:space="preserve">Petricevic, O. and Teece, D.J. (2019), "The structural reshaping of globalization: implications for strategic sectors, profiting from innovation, and the multinational enterprise",</w:t>
+        <w:t xml:space="preserve">, Vol. 36 No. 4, pp.859-866, https://doi.org/10.1111/j.1745-9125.1998.tb01268.x</w:t>
+      </w:r>
+    </w:p>
+    <w:p>
+      <w:pPr>
+        <w:pStyle w:val="BodyText"/>
+      </w:pPr>
+      <w:r>
+        <w:t xml:space="preserve">Petricevic, O. and Teece, D.J. (2019),</w:t>
+      </w:r>
+      <w:r>
+        <w:t xml:space="preserve"> </w:t>
+      </w:r>
+      <w:r>
+        <w:t xml:space="preserve">“</w:t>
+      </w:r>
+      <w:r>
+        <w:t xml:space="preserve">The structural reshaping of globalization: implications for strategic sectors, profiting from innovation, and the multinational enterprise</w:t>
+      </w:r>
+      <w:r>
+        <w:t xml:space="preserve">”</w:t>
+      </w:r>
+      <w:r>
+        <w:t xml:space="preserve">,</w:t>
       </w:r>
       <w:r>
         <w:t xml:space="preserve"> </w:t>
@@ -2598,26 +2763,30 @@
         <w:t xml:space="preserve">Journal of International Business Studies</w:t>
       </w:r>
       <w:r>
-        <w:t xml:space="preserve">, Vol. 50 No. 9, pp.1487-1512,</w:t>
-      </w:r>
-      <w:r>
-        <w:t xml:space="preserve"> </w:t>
-      </w:r>
-      <w:hyperlink r:id="rId87">
-        <w:r>
-          <w:rPr>
-            <w:rStyle w:val="Hyperlink"/>
-          </w:rPr>
-          <w:t xml:space="preserve">https://doi.org/10.1057/s41267-019-00269-x</w:t>
-        </w:r>
-      </w:hyperlink>
-    </w:p>
-    <w:p>
-      <w:pPr>
-        <w:pStyle w:val="BodyText"/>
-      </w:pPr>
-      <w:r>
-        <w:t xml:space="preserve">Pisani, N., Garcia-Bernardo, J. and Heemskerk, E. (2020), "Does it pay to be a multinational? A large-sample, cross-national replication assessing the multinationality-performance relationship",</w:t>
+        <w:t xml:space="preserve">, Vol. 50 No. 9, pp.1487-1512, https://doi.org/10.1057/s41267-019-00269-x</w:t>
+      </w:r>
+    </w:p>
+    <w:p>
+      <w:pPr>
+        <w:pStyle w:val="BodyText"/>
+      </w:pPr>
+      <w:r>
+        <w:t xml:space="preserve">Pisani, N., Garcia-Bernardo, J. and Heemskerk, E. (2020),</w:t>
+      </w:r>
+      <w:r>
+        <w:t xml:space="preserve"> </w:t>
+      </w:r>
+      <w:r>
+        <w:t xml:space="preserve">“</w:t>
+      </w:r>
+      <w:r>
+        <w:t xml:space="preserve">Does it pay to be a multinational? A large-sample, cross-national replication assessing the multinationality-performance relationship</w:t>
+      </w:r>
+      <w:r>
+        <w:t xml:space="preserve">”</w:t>
+      </w:r>
+      <w:r>
+        <w:t xml:space="preserve">,</w:t>
       </w:r>
       <w:r>
         <w:t xml:space="preserve"> </w:t>
@@ -2630,51 +2799,65 @@
         <w:t xml:space="preserve">Strategic Management Journal</w:t>
       </w:r>
       <w:r>
-        <w:t xml:space="preserve">, Vol. 41 No. 1, pp.152-172,</w:t>
-      </w:r>
-      <w:r>
-        <w:t xml:space="preserve"> </w:t>
-      </w:r>
-      <w:hyperlink r:id="rId88">
-        <w:r>
-          <w:rPr>
-            <w:rStyle w:val="Hyperlink"/>
-          </w:rPr>
-          <w:t xml:space="preserve">https://doi.org/10.1002/smj.3087</w:t>
-        </w:r>
-      </w:hyperlink>
-    </w:p>
-    <w:p>
-      <w:pPr>
-        <w:pStyle w:val="BodyText"/>
-      </w:pPr>
-      <w:r>
-        <w:t xml:space="preserve">Prime Minister of Vietnam (2020), "Decision No. 749/QD-TTg approving the 'National Digital Transformation Programme by 2025, with orientations towards 2030'", available at:</w:t>
-      </w:r>
-      <w:r>
-        <w:t xml:space="preserve"> </w:t>
-      </w:r>
-      <w:hyperlink r:id="rId89">
-        <w:r>
-          <w:rPr>
-            <w:rStyle w:val="Hyperlink"/>
-          </w:rPr>
-          <w:t xml:space="preserve">https://english.luatvietnam.vn/decision-no-749-qd-ttg-on-approving-the-national-digital-transformation-program-until-2025-with-a-vision-184241-doc1.html</w:t>
-        </w:r>
-      </w:hyperlink>
-      <w:r>
-        <w:t xml:space="preserve"> </w:t>
-      </w:r>
-      <w:r>
-        <w:t xml:space="preserve">(accessed 9 May 2026).</w:t>
-      </w:r>
-    </w:p>
-    <w:p>
-      <w:pPr>
-        <w:pStyle w:val="BodyText"/>
-      </w:pPr>
-      <w:r>
-        <w:t xml:space="preserve">Shaver, J.M. (2020), "Causal identification through a cumulative body of research in the study of strategy and organizations",</w:t>
+        <w:t xml:space="preserve">, Vol. 41 No. 1, pp.152-172, https://doi.org/10.1002/smj.3087</w:t>
+      </w:r>
+    </w:p>
+    <w:p>
+      <w:pPr>
+        <w:pStyle w:val="BodyText"/>
+      </w:pPr>
+      <w:r>
+        <w:t xml:space="preserve">Prime Minister of Vietnam (2020),</w:t>
+      </w:r>
+      <w:r>
+        <w:t xml:space="preserve"> </w:t>
+      </w:r>
+      <w:r>
+        <w:t xml:space="preserve">“</w:t>
+      </w:r>
+      <w:r>
+        <w:t xml:space="preserve">Decision No. 749/QD-TTg approving the</w:t>
+      </w:r>
+      <w:r>
+        <w:t xml:space="preserve"> </w:t>
+      </w:r>
+      <w:r>
+        <w:t xml:space="preserve">‘</w:t>
+      </w:r>
+      <w:r>
+        <w:t xml:space="preserve">National Digital Transformation Programme by 2025, with orientations towards 2030</w:t>
+      </w:r>
+      <w:r>
+        <w:t xml:space="preserve">’</w:t>
+      </w:r>
+      <w:r>
+        <w:t xml:space="preserve">”</w:t>
+      </w:r>
+      <w:r>
+        <w:t xml:space="preserve">, available at: https://english.luatvietnam.vn/decision-no-749-qd-ttg-on-approving-the-national-digital-transformation-program-until-2025-with-a-vision-184241-doc1.html (accessed 9 May 2026).</w:t>
+      </w:r>
+    </w:p>
+    <w:p>
+      <w:pPr>
+        <w:pStyle w:val="BodyText"/>
+      </w:pPr>
+      <w:r>
+        <w:t xml:space="preserve">Shaver, J.M. (2020),</w:t>
+      </w:r>
+      <w:r>
+        <w:t xml:space="preserve"> </w:t>
+      </w:r>
+      <w:r>
+        <w:t xml:space="preserve">“</w:t>
+      </w:r>
+      <w:r>
+        <w:t xml:space="preserve">Causal identification through a cumulative body of research in the study of strategy and organizations</w:t>
+      </w:r>
+      <w:r>
+        <w:t xml:space="preserve">”</w:t>
+      </w:r>
+      <w:r>
+        <w:t xml:space="preserve">,</w:t>
       </w:r>
       <w:r>
         <w:t xml:space="preserve"> </w:t>
@@ -2687,26 +2870,30 @@
         <w:t xml:space="preserve">Journal of Management</w:t>
       </w:r>
       <w:r>
-        <w:t xml:space="preserve">, Vol. 46 No. 7, pp.1244-1256,</w:t>
-      </w:r>
-      <w:r>
-        <w:t xml:space="preserve"> </w:t>
-      </w:r>
-      <w:hyperlink r:id="rId90">
-        <w:r>
-          <w:rPr>
-            <w:rStyle w:val="Hyperlink"/>
-          </w:rPr>
-          <w:t xml:space="preserve">https://doi.org/10.1177/0149206319846272</w:t>
-        </w:r>
-      </w:hyperlink>
-    </w:p>
-    <w:p>
-      <w:pPr>
-        <w:pStyle w:val="BodyText"/>
-      </w:pPr>
-      <w:r>
-        <w:t xml:space="preserve">Staiger, D. and Stock, J.H. (1997), "Instrumental variables regression with weak instruments",</w:t>
+        <w:t xml:space="preserve">, Vol. 46 No. 7, pp.1244-1256, https://doi.org/10.1177/0149206319846272</w:t>
+      </w:r>
+    </w:p>
+    <w:p>
+      <w:pPr>
+        <w:pStyle w:val="BodyText"/>
+      </w:pPr>
+      <w:r>
+        <w:t xml:space="preserve">Staiger, D. and Stock, J.H. (1997),</w:t>
+      </w:r>
+      <w:r>
+        <w:t xml:space="preserve"> </w:t>
+      </w:r>
+      <w:r>
+        <w:t xml:space="preserve">“</w:t>
+      </w:r>
+      <w:r>
+        <w:t xml:space="preserve">Instrumental variables regression with weak instruments</w:t>
+      </w:r>
+      <w:r>
+        <w:t xml:space="preserve">”</w:t>
+      </w:r>
+      <w:r>
+        <w:t xml:space="preserve">,</w:t>
       </w:r>
       <w:r>
         <w:t xml:space="preserve"> </w:t>
@@ -2719,26 +2906,30 @@
         <w:t xml:space="preserve">Econometrica</w:t>
       </w:r>
       <w:r>
-        <w:t xml:space="preserve">, Vol. 65 No. 3, pp.557-586,</w:t>
-      </w:r>
-      <w:r>
-        <w:t xml:space="preserve"> </w:t>
-      </w:r>
-      <w:hyperlink r:id="rId91">
-        <w:r>
-          <w:rPr>
-            <w:rStyle w:val="Hyperlink"/>
-          </w:rPr>
-          <w:t xml:space="preserve">https://doi.org/10.2307/2171753</w:t>
-        </w:r>
-      </w:hyperlink>
-    </w:p>
-    <w:p>
-      <w:pPr>
-        <w:pStyle w:val="BodyText"/>
-      </w:pPr>
-      <w:r>
-        <w:t xml:space="preserve">Stallkamp, M. and Schotter, A.P.J. (2021), "Platforms without borders? The international strategies of digital platform firms",</w:t>
+        <w:t xml:space="preserve">, Vol. 65 No. 3, pp.557-586, https://doi.org/10.2307/2171753</w:t>
+      </w:r>
+    </w:p>
+    <w:p>
+      <w:pPr>
+        <w:pStyle w:val="BodyText"/>
+      </w:pPr>
+      <w:r>
+        <w:t xml:space="preserve">Stallkamp, M. and Schotter, A.P.J. (2021),</w:t>
+      </w:r>
+      <w:r>
+        <w:t xml:space="preserve"> </w:t>
+      </w:r>
+      <w:r>
+        <w:t xml:space="preserve">“</w:t>
+      </w:r>
+      <w:r>
+        <w:t xml:space="preserve">Platforms without borders? The international strategies of digital platform firms</w:t>
+      </w:r>
+      <w:r>
+        <w:t xml:space="preserve">”</w:t>
+      </w:r>
+      <w:r>
+        <w:t xml:space="preserve">,</w:t>
       </w:r>
       <w:r>
         <w:t xml:space="preserve"> </w:t>
@@ -2751,26 +2942,30 @@
         <w:t xml:space="preserve">Global Strategy Journal</w:t>
       </w:r>
       <w:r>
-        <w:t xml:space="preserve">, Vol. 11 No. 1, pp.58-80,</w:t>
-      </w:r>
-      <w:r>
-        <w:t xml:space="preserve"> </w:t>
-      </w:r>
-      <w:hyperlink r:id="rId92">
-        <w:r>
-          <w:rPr>
-            <w:rStyle w:val="Hyperlink"/>
-          </w:rPr>
-          <w:t xml:space="preserve">https://doi.org/10.1002/gsj.1336</w:t>
-        </w:r>
-      </w:hyperlink>
-    </w:p>
-    <w:p>
-      <w:pPr>
-        <w:pStyle w:val="BodyText"/>
-      </w:pPr>
-      <w:r>
-        <w:t xml:space="preserve">Strange, R. and Zucchella, A. (2017), "Industry 4.0, global value chains and international business",</w:t>
+        <w:t xml:space="preserve">, Vol. 11 No. 1, pp.58-80, https://doi.org/10.1002/gsj.1336</w:t>
+      </w:r>
+    </w:p>
+    <w:p>
+      <w:pPr>
+        <w:pStyle w:val="BodyText"/>
+      </w:pPr>
+      <w:r>
+        <w:t xml:space="preserve">Strange, R. and Zucchella, A. (2017),</w:t>
+      </w:r>
+      <w:r>
+        <w:t xml:space="preserve"> </w:t>
+      </w:r>
+      <w:r>
+        <w:t xml:space="preserve">“</w:t>
+      </w:r>
+      <w:r>
+        <w:t xml:space="preserve">Industry 4.0, global value chains and international business</w:t>
+      </w:r>
+      <w:r>
+        <w:t xml:space="preserve">”</w:t>
+      </w:r>
+      <w:r>
+        <w:t xml:space="preserve">,</w:t>
       </w:r>
       <w:r>
         <w:t xml:space="preserve"> </w:t>
@@ -2783,26 +2978,30 @@
         <w:t xml:space="preserve">Multinational Business Review</w:t>
       </w:r>
       <w:r>
-        <w:t xml:space="preserve">, Vol. 25 No. 3, pp.174-184,</w:t>
-      </w:r>
-      <w:r>
-        <w:t xml:space="preserve"> </w:t>
-      </w:r>
-      <w:hyperlink r:id="rId93">
-        <w:r>
-          <w:rPr>
-            <w:rStyle w:val="Hyperlink"/>
-          </w:rPr>
-          <w:t xml:space="preserve">https://doi.org/10.1108/MBR-05-2017-0028</w:t>
-        </w:r>
-      </w:hyperlink>
-    </w:p>
-    <w:p>
-      <w:pPr>
-        <w:pStyle w:val="BodyText"/>
-      </w:pPr>
-      <w:r>
-        <w:t xml:space="preserve">Teece, D.J. (2007), "Explicating dynamic capabilities: the nature and microfoundations of (sustainable) enterprise performance",</w:t>
+        <w:t xml:space="preserve">, Vol. 25 No. 3, pp.174-184, https://doi.org/10.1108/MBR-05-2017-0028</w:t>
+      </w:r>
+    </w:p>
+    <w:p>
+      <w:pPr>
+        <w:pStyle w:val="BodyText"/>
+      </w:pPr>
+      <w:r>
+        <w:t xml:space="preserve">Teece, D.J. (2007),</w:t>
+      </w:r>
+      <w:r>
+        <w:t xml:space="preserve"> </w:t>
+      </w:r>
+      <w:r>
+        <w:t xml:space="preserve">“</w:t>
+      </w:r>
+      <w:r>
+        <w:t xml:space="preserve">Explicating dynamic capabilities: the nature and microfoundations of (sustainable) enterprise performance</w:t>
+      </w:r>
+      <w:r>
+        <w:t xml:space="preserve">”</w:t>
+      </w:r>
+      <w:r>
+        <w:t xml:space="preserve">,</w:t>
       </w:r>
       <w:r>
         <w:t xml:space="preserve"> </w:t>
@@ -2815,26 +3014,30 @@
         <w:t xml:space="preserve">Strategic Management Journal</w:t>
       </w:r>
       <w:r>
-        <w:t xml:space="preserve">, Vol. 28 No. 13, pp.1319-1350,</w:t>
-      </w:r>
-      <w:r>
-        <w:t xml:space="preserve"> </w:t>
-      </w:r>
-      <w:hyperlink r:id="rId94">
-        <w:r>
-          <w:rPr>
-            <w:rStyle w:val="Hyperlink"/>
-          </w:rPr>
-          <w:t xml:space="preserve">https://doi.org/10.1002/smj.640</w:t>
-        </w:r>
-      </w:hyperlink>
-    </w:p>
-    <w:p>
-      <w:pPr>
-        <w:pStyle w:val="BodyText"/>
-      </w:pPr>
-      <w:r>
-        <w:t xml:space="preserve">Vahlne, J.-E. (2020), "Development of the Uppsala model of internationalization process: from internationalization to evolution",</w:t>
+        <w:t xml:space="preserve">, Vol. 28 No. 13, pp.1319-1350, https://doi.org/10.1002/smj.640</w:t>
+      </w:r>
+    </w:p>
+    <w:p>
+      <w:pPr>
+        <w:pStyle w:val="BodyText"/>
+      </w:pPr>
+      <w:r>
+        <w:t xml:space="preserve">Vahlne, J.-E. (2020),</w:t>
+      </w:r>
+      <w:r>
+        <w:t xml:space="preserve"> </w:t>
+      </w:r>
+      <w:r>
+        <w:t xml:space="preserve">“</w:t>
+      </w:r>
+      <w:r>
+        <w:t xml:space="preserve">Development of the Uppsala model of internationalization process: from internationalization to evolution</w:t>
+      </w:r>
+      <w:r>
+        <w:t xml:space="preserve">”</w:t>
+      </w:r>
+      <w:r>
+        <w:t xml:space="preserve">,</w:t>
       </w:r>
       <w:r>
         <w:t xml:space="preserve"> </w:t>
@@ -2847,26 +3050,30 @@
         <w:t xml:space="preserve">Global Strategy Journal</w:t>
       </w:r>
       <w:r>
-        <w:t xml:space="preserve">, Vol. 10 No. 2, pp.239-250,</w:t>
-      </w:r>
-      <w:r>
-        <w:t xml:space="preserve"> </w:t>
-      </w:r>
-      <w:hyperlink r:id="rId95">
-        <w:r>
-          <w:rPr>
-            <w:rStyle w:val="Hyperlink"/>
-          </w:rPr>
-          <w:t xml:space="preserve">https://doi.org/10.1002/gsj.1375</w:t>
-        </w:r>
-      </w:hyperlink>
-    </w:p>
-    <w:p>
-      <w:pPr>
-        <w:pStyle w:val="BodyText"/>
-      </w:pPr>
-      <w:r>
-        <w:t xml:space="preserve">Vahlne, J.-E. and Johanson, J. (2017), "From internationalization to evolution: the Uppsala model at 40 years",</w:t>
+        <w:t xml:space="preserve">, Vol. 10 No. 2, pp.239-250, https://doi.org/10.1002/gsj.1375</w:t>
+      </w:r>
+    </w:p>
+    <w:p>
+      <w:pPr>
+        <w:pStyle w:val="BodyText"/>
+      </w:pPr>
+      <w:r>
+        <w:t xml:space="preserve">Vahlne, J.-E. and Johanson, J. (2017),</w:t>
+      </w:r>
+      <w:r>
+        <w:t xml:space="preserve"> </w:t>
+      </w:r>
+      <w:r>
+        <w:t xml:space="preserve">“</w:t>
+      </w:r>
+      <w:r>
+        <w:t xml:space="preserve">From internationalization to evolution: the Uppsala model at 40 years</w:t>
+      </w:r>
+      <w:r>
+        <w:t xml:space="preserve">”</w:t>
+      </w:r>
+      <w:r>
+        <w:t xml:space="preserve">,</w:t>
       </w:r>
       <w:r>
         <w:t xml:space="preserve"> </w:t>
@@ -2879,26 +3086,30 @@
         <w:t xml:space="preserve">Journal of International Business Studies</w:t>
       </w:r>
       <w:r>
-        <w:t xml:space="preserve">, Vol. 48 No. 9, pp.1087-1102,</w:t>
-      </w:r>
-      <w:r>
-        <w:t xml:space="preserve"> </w:t>
-      </w:r>
-      <w:hyperlink r:id="rId96">
-        <w:r>
-          <w:rPr>
-            <w:rStyle w:val="Hyperlink"/>
-          </w:rPr>
-          <w:t xml:space="preserve">https://doi.org/10.1057/s41267-017-0107-7</w:t>
-        </w:r>
-      </w:hyperlink>
-    </w:p>
-    <w:p>
-      <w:pPr>
-        <w:pStyle w:val="BodyText"/>
-      </w:pPr>
-      <w:r>
-        <w:t xml:space="preserve">Verhoef, P.C., Broekhuizen, T., Bart, Y., Bhattacharya, A., Dong, J.Q., Fabian, N. and Haenlein, M. (2021), "Digital transformation: a multidisciplinary reflection and research agenda",</w:t>
+        <w:t xml:space="preserve">, Vol. 48 No. 9, pp.1087-1102, https://doi.org/10.1057/s41267-017-0107-7</w:t>
+      </w:r>
+    </w:p>
+    <w:p>
+      <w:pPr>
+        <w:pStyle w:val="BodyText"/>
+      </w:pPr>
+      <w:r>
+        <w:t xml:space="preserve">Verhoef, P.C., Broekhuizen, T., Bart, Y., Bhattacharya, A., Dong, J.Q., Fabian, N. and Haenlein, M. (2021),</w:t>
+      </w:r>
+      <w:r>
+        <w:t xml:space="preserve"> </w:t>
+      </w:r>
+      <w:r>
+        <w:t xml:space="preserve">“</w:t>
+      </w:r>
+      <w:r>
+        <w:t xml:space="preserve">Digital transformation: a multidisciplinary reflection and research agenda</w:t>
+      </w:r>
+      <w:r>
+        <w:t xml:space="preserve">”</w:t>
+      </w:r>
+      <w:r>
+        <w:t xml:space="preserve">,</w:t>
       </w:r>
       <w:r>
         <w:t xml:space="preserve"> </w:t>
@@ -2911,26 +3122,30 @@
         <w:t xml:space="preserve">Journal of Business Research</w:t>
       </w:r>
       <w:r>
-        <w:t xml:space="preserve">, Vol. 122, pp.889-901,</w:t>
-      </w:r>
-      <w:r>
-        <w:t xml:space="preserve"> </w:t>
-      </w:r>
-      <w:hyperlink r:id="rId97">
-        <w:r>
-          <w:rPr>
-            <w:rStyle w:val="Hyperlink"/>
-          </w:rPr>
-          <w:t xml:space="preserve">https://doi.org/10.1016/j.jbusres.2019.09.022</w:t>
-        </w:r>
-      </w:hyperlink>
-    </w:p>
-    <w:p>
-      <w:pPr>
-        <w:pStyle w:val="BodyText"/>
-      </w:pPr>
-      <w:r>
-        <w:t xml:space="preserve">Vernon, R. (1979), "The product cycle hypothesis in a new international environment",</w:t>
+        <w:t xml:space="preserve">, Vol. 122, pp.889-901, https://doi.org/10.1016/j.jbusres.2019.09.022</w:t>
+      </w:r>
+    </w:p>
+    <w:p>
+      <w:pPr>
+        <w:pStyle w:val="BodyText"/>
+      </w:pPr>
+      <w:r>
+        <w:t xml:space="preserve">Vernon, R. (1979),</w:t>
+      </w:r>
+      <w:r>
+        <w:t xml:space="preserve"> </w:t>
+      </w:r>
+      <w:r>
+        <w:t xml:space="preserve">“</w:t>
+      </w:r>
+      <w:r>
+        <w:t xml:space="preserve">The product cycle hypothesis in a new international environment</w:t>
+      </w:r>
+      <w:r>
+        <w:t xml:space="preserve">”</w:t>
+      </w:r>
+      <w:r>
+        <w:t xml:space="preserve">,</w:t>
       </w:r>
       <w:r>
         <w:t xml:space="preserve"> </w:t>
@@ -2943,26 +3158,30 @@
         <w:t xml:space="preserve">Oxford Bulletin of Economics and Statistics</w:t>
       </w:r>
       <w:r>
-        <w:t xml:space="preserve">, Vol. 41 No. 4, pp.255-267,</w:t>
-      </w:r>
-      <w:r>
-        <w:t xml:space="preserve"> </w:t>
-      </w:r>
-      <w:hyperlink r:id="rId98">
-        <w:r>
-          <w:rPr>
-            <w:rStyle w:val="Hyperlink"/>
-          </w:rPr>
-          <w:t xml:space="preserve">https://doi.org/10.1111/j.1468-0084.1979.mp41004002.x</w:t>
-        </w:r>
-      </w:hyperlink>
-    </w:p>
-    <w:p>
-      <w:pPr>
-        <w:pStyle w:val="BodyText"/>
-      </w:pPr>
-      <w:r>
-        <w:t xml:space="preserve">Vial, G. (2019), "Understanding digital transformation: a review and a research agenda",</w:t>
+        <w:t xml:space="preserve">, Vol. 41 No. 4, pp.255-267, https://doi.org/10.1111/j.1468-0084.1979.mp41004002.x</w:t>
+      </w:r>
+    </w:p>
+    <w:p>
+      <w:pPr>
+        <w:pStyle w:val="BodyText"/>
+      </w:pPr>
+      <w:r>
+        <w:t xml:space="preserve">Vial, G. (2019),</w:t>
+      </w:r>
+      <w:r>
+        <w:t xml:space="preserve"> </w:t>
+      </w:r>
+      <w:r>
+        <w:t xml:space="preserve">“</w:t>
+      </w:r>
+      <w:r>
+        <w:t xml:space="preserve">Understanding digital transformation: a review and a research agenda</w:t>
+      </w:r>
+      <w:r>
+        <w:t xml:space="preserve">”</w:t>
+      </w:r>
+      <w:r>
+        <w:t xml:space="preserve">,</w:t>
       </w:r>
       <w:r>
         <w:t xml:space="preserve"> </w:t>
@@ -2975,26 +3194,30 @@
         <w:t xml:space="preserve">Journal of Strategic Information Systems</w:t>
       </w:r>
       <w:r>
-        <w:t xml:space="preserve">, Vol. 28 No. 2, pp.118-144,</w:t>
-      </w:r>
-      <w:r>
-        <w:t xml:space="preserve"> </w:t>
-      </w:r>
-      <w:hyperlink r:id="rId99">
-        <w:r>
-          <w:rPr>
-            <w:rStyle w:val="Hyperlink"/>
-          </w:rPr>
-          <w:t xml:space="preserve">https://doi.org/10.1016/j.jsis.2019.01.003</w:t>
-        </w:r>
-      </w:hyperlink>
-    </w:p>
-    <w:p>
-      <w:pPr>
-        <w:pStyle w:val="BodyText"/>
-      </w:pPr>
-      <w:r>
-        <w:t xml:space="preserve">Wagner, J. (2007), "Exports and productivity: a survey of the evidence from firm-level data",</w:t>
+        <w:t xml:space="preserve">, Vol. 28 No. 2, pp.118-144, https://doi.org/10.1016/j.jsis.2019.01.003</w:t>
+      </w:r>
+    </w:p>
+    <w:p>
+      <w:pPr>
+        <w:pStyle w:val="BodyText"/>
+      </w:pPr>
+      <w:r>
+        <w:t xml:space="preserve">Wagner, J. (2007),</w:t>
+      </w:r>
+      <w:r>
+        <w:t xml:space="preserve"> </w:t>
+      </w:r>
+      <w:r>
+        <w:t xml:space="preserve">“</w:t>
+      </w:r>
+      <w:r>
+        <w:t xml:space="preserve">Exports and productivity: a survey of the evidence from firm-level data</w:t>
+      </w:r>
+      <w:r>
+        <w:t xml:space="preserve">”</w:t>
+      </w:r>
+      <w:r>
+        <w:t xml:space="preserve">,</w:t>
       </w:r>
       <w:r>
         <w:t xml:space="preserve"> </w:t>
@@ -3007,19 +3230,8 @@
         <w:t xml:space="preserve">The World Economy</w:t>
       </w:r>
       <w:r>
-        <w:t xml:space="preserve">, Vol. 30 No. 1, pp.60-82,</w:t>
-      </w:r>
-      <w:r>
-        <w:t xml:space="preserve"> </w:t>
-      </w:r>
-      <w:hyperlink r:id="rId100">
-        <w:r>
-          <w:rPr>
-            <w:rStyle w:val="Hyperlink"/>
-          </w:rPr>
-          <w:t xml:space="preserve">https://doi.org/10.1111/j.1467-9701.2007.00872.x</w:t>
-        </w:r>
-      </w:hyperlink>
+        <w:t xml:space="preserve">, Vol. 30 No. 1, pp.60-82, https://doi.org/10.1111/j.1467-9701.2007.00872.x</w:t>
+      </w:r>
     </w:p>
     <w:p>
       <w:pPr>
@@ -3081,24 +3293,7 @@
         <w:t xml:space="preserve">Vietnam Enterprise Survey 2009: Data File</w:t>
       </w:r>
       <w:r>
-        <w:t xml:space="preserve">, Enterprise Surveys, World Bank Group, available at:</w:t>
-      </w:r>
-      <w:r>
-        <w:t xml:space="preserve"> </w:t>
-      </w:r>
-      <w:hyperlink r:id="rId101">
-        <w:r>
-          <w:rPr>
-            <w:rStyle w:val="Hyperlink"/>
-          </w:rPr>
-          <w:t xml:space="preserve">https://www.enterprisesurveys.org/en/enterprisesurveys</w:t>
-        </w:r>
-      </w:hyperlink>
-      <w:r>
-        <w:t xml:space="preserve"> </w:t>
-      </w:r>
-      <w:r>
-        <w:t xml:space="preserve">(accessed 9 May 2026).</w:t>
+        <w:t xml:space="preserve">, Enterprise Surveys, World Bank Group, available at: https://www.enterprisesurveys.org/en/enterprisesurveys (accessed 9 May 2026).</w:t>
       </w:r>
     </w:p>
     <w:p>
@@ -3119,24 +3314,7 @@
         <w:t xml:space="preserve">Vietnam Enterprise Survey 2015: Data File</w:t>
       </w:r>
       <w:r>
-        <w:t xml:space="preserve">, Enterprise Surveys, World Bank Group, available at:</w:t>
-      </w:r>
-      <w:r>
-        <w:t xml:space="preserve"> </w:t>
-      </w:r>
-      <w:hyperlink r:id="rId101">
-        <w:r>
-          <w:rPr>
-            <w:rStyle w:val="Hyperlink"/>
-          </w:rPr>
-          <w:t xml:space="preserve">https://www.enterprisesurveys.org/en/enterprisesurveys</w:t>
-        </w:r>
-      </w:hyperlink>
-      <w:r>
-        <w:t xml:space="preserve"> </w:t>
-      </w:r>
-      <w:r>
-        <w:t xml:space="preserve">(accessed 9 May 2026).</w:t>
+        <w:t xml:space="preserve">, Enterprise Surveys, World Bank Group, available at: https://www.enterprisesurveys.org/en/enterprisesurveys (accessed 9 May 2026).</w:t>
       </w:r>
     </w:p>
     <w:p>
@@ -3157,24 +3335,7 @@
         <w:t xml:space="preserve">Vietnam Enterprise Survey 2023: Data File</w:t>
       </w:r>
       <w:r>
-        <w:t xml:space="preserve">, Enterprise Surveys, World Bank Group, available at:</w:t>
-      </w:r>
-      <w:r>
-        <w:t xml:space="preserve"> </w:t>
-      </w:r>
-      <w:hyperlink r:id="rId101">
-        <w:r>
-          <w:rPr>
-            <w:rStyle w:val="Hyperlink"/>
-          </w:rPr>
-          <w:t xml:space="preserve">https://www.enterprisesurveys.org/en/enterprisesurveys</w:t>
-        </w:r>
-      </w:hyperlink>
-      <w:r>
-        <w:t xml:space="preserve"> </w:t>
-      </w:r>
-      <w:r>
-        <w:t xml:space="preserve">(accessed 9 May 2026).</w:t>
+        <w:t xml:space="preserve">, Enterprise Surveys, World Bank Group, available at: https://www.enterprisesurveys.org/en/enterprisesurveys (accessed 9 May 2026).</w:t>
       </w:r>
     </w:p>
     <w:p>
@@ -3198,32 +3359,30 @@
         <w:t xml:space="preserve"> </w:t>
       </w:r>
       <w:r>
-        <w:t xml:space="preserve">[data set], available at:</w:t>
-      </w:r>
-      <w:r>
-        <w:t xml:space="preserve"> </w:t>
-      </w:r>
-      <w:hyperlink r:id="rId102">
-        <w:r>
-          <w:rPr>
-            <w:rStyle w:val="Hyperlink"/>
-          </w:rPr>
-          <w:t xml:space="preserve">https://databank.worldbank.org/source/world-development-indicators</w:t>
-        </w:r>
-      </w:hyperlink>
-      <w:r>
-        <w:t xml:space="preserve"> </w:t>
-      </w:r>
-      <w:r>
-        <w:t xml:space="preserve">(accessed 9 May 2026).</w:t>
-      </w:r>
-    </w:p>
-    <w:p>
-      <w:pPr>
-        <w:pStyle w:val="BodyText"/>
-      </w:pPr>
-      <w:r>
-        <w:t xml:space="preserve">Wright, M., Filatotchev, I., Hoskisson, R.E. and Peng, M.W. (2005), "Strategy research in emerging economies: challenging the conventional wisdom",</w:t>
+        <w:t xml:space="preserve">[data set], available at: https://databank.worldbank.org/source/world-development-indicators (accessed 9 May 2026).</w:t>
+      </w:r>
+    </w:p>
+    <w:p>
+      <w:pPr>
+        <w:pStyle w:val="BodyText"/>
+      </w:pPr>
+      <w:r>
+        <w:t xml:space="preserve">Wright, M., Filatotchev, I., Hoskisson, R.E. and Peng, M.W. (2005),</w:t>
+      </w:r>
+      <w:r>
+        <w:t xml:space="preserve"> </w:t>
+      </w:r>
+      <w:r>
+        <w:t xml:space="preserve">“</w:t>
+      </w:r>
+      <w:r>
+        <w:t xml:space="preserve">Strategy research in emerging economies: challenging the conventional wisdom</w:t>
+      </w:r>
+      <w:r>
+        <w:t xml:space="preserve">”</w:t>
+      </w:r>
+      <w:r>
+        <w:t xml:space="preserve">,</w:t>
       </w:r>
       <w:r>
         <w:t xml:space="preserve"> </w:t>
@@ -3236,26 +3395,30 @@
         <w:t xml:space="preserve">Journal of Management Studies</w:t>
       </w:r>
       <w:r>
-        <w:t xml:space="preserve">, Vol. 42 No. 1, pp.1-33,</w:t>
-      </w:r>
-      <w:r>
-        <w:t xml:space="preserve"> </w:t>
-      </w:r>
-      <w:hyperlink r:id="rId103">
-        <w:r>
-          <w:rPr>
-            <w:rStyle w:val="Hyperlink"/>
-          </w:rPr>
-          <w:t xml:space="preserve">https://doi.org/10.1111/j.1467-6486.2005.00487.x</w:t>
-        </w:r>
-      </w:hyperlink>
-    </w:p>
-    <w:p>
-      <w:pPr>
-        <w:pStyle w:val="BodyText"/>
-      </w:pPr>
-      <w:r>
-        <w:t xml:space="preserve">Wu, F., Fan, D. and Chen, L. (2022), "Untangling the internationalization-performance relationship in emerging-economy multinationals: a meta-analytic review",</w:t>
+        <w:t xml:space="preserve">, Vol. 42 No. 1, pp.1-33, https://doi.org/10.1111/j.1467-6486.2005.00487.x</w:t>
+      </w:r>
+    </w:p>
+    <w:p>
+      <w:pPr>
+        <w:pStyle w:val="BodyText"/>
+      </w:pPr>
+      <w:r>
+        <w:t xml:space="preserve">Wu, F., Fan, D. and Chen, L. (2022),</w:t>
+      </w:r>
+      <w:r>
+        <w:t xml:space="preserve"> </w:t>
+      </w:r>
+      <w:r>
+        <w:t xml:space="preserve">“</w:t>
+      </w:r>
+      <w:r>
+        <w:t xml:space="preserve">Untangling the internationalization-performance relationship in emerging-economy multinationals: a meta-analytic review</w:t>
+      </w:r>
+      <w:r>
+        <w:t xml:space="preserve">”</w:t>
+      </w:r>
+      <w:r>
+        <w:t xml:space="preserve">,</w:t>
       </w:r>
       <w:r>
         <w:t xml:space="preserve"> </w:t>
@@ -3268,26 +3431,30 @@
         <w:t xml:space="preserve">Management International Review</w:t>
       </w:r>
       <w:r>
-        <w:t xml:space="preserve">, Vol. 62 No. 2, pp.203-243,</w:t>
-      </w:r>
-      <w:r>
-        <w:t xml:space="preserve"> </w:t>
-      </w:r>
-      <w:hyperlink r:id="rId104">
-        <w:r>
-          <w:rPr>
-            <w:rStyle w:val="Hyperlink"/>
-          </w:rPr>
-          <w:t xml:space="preserve">https://doi.org/10.1007/s11575-022-00466-1</w:t>
-        </w:r>
-      </w:hyperlink>
-    </w:p>
-    <w:p>
-      <w:pPr>
-        <w:pStyle w:val="BodyText"/>
-      </w:pPr>
-      <w:r>
-        <w:t xml:space="preserve">Wu, J., Wang, C., Hong, J., Piperopoulos, P. and Zhuo, S. (2016), "Internationalization and innovation performance of emerging market enterprises: the role of host-country institutional development",</w:t>
+        <w:t xml:space="preserve">, Vol. 62 No. 2, pp.203-243, https://doi.org/10.1007/s11575-022-00466-1</w:t>
+      </w:r>
+    </w:p>
+    <w:p>
+      <w:pPr>
+        <w:pStyle w:val="BodyText"/>
+      </w:pPr>
+      <w:r>
+        <w:t xml:space="preserve">Wu, J., Wang, C., Hong, J., Piperopoulos, P. and Zhuo, S. (2016),</w:t>
+      </w:r>
+      <w:r>
+        <w:t xml:space="preserve"> </w:t>
+      </w:r>
+      <w:r>
+        <w:t xml:space="preserve">“</w:t>
+      </w:r>
+      <w:r>
+        <w:t xml:space="preserve">Internationalization and innovation performance of emerging market enterprises: the role of host-country institutional development</w:t>
+      </w:r>
+      <w:r>
+        <w:t xml:space="preserve">”</w:t>
+      </w:r>
+      <w:r>
+        <w:t xml:space="preserve">,</w:t>
       </w:r>
       <w:r>
         <w:t xml:space="preserve"> </w:t>
@@ -3300,23 +3467,15 @@
         <w:t xml:space="preserve">Journal of World Business</w:t>
       </w:r>
       <w:r>
-        <w:t xml:space="preserve">, Vol. 51 No. 2, pp.251-263,</w:t>
-      </w:r>
-      <w:r>
-        <w:t xml:space="preserve"> </w:t>
-      </w:r>
-      <w:hyperlink r:id="rId105">
-        <w:r>
-          <w:rPr>
-            <w:rStyle w:val="Hyperlink"/>
-          </w:rPr>
-          <w:t xml:space="preserve">https://doi.org/10.1016/j.jwb.2015.09.001</w:t>
-        </w:r>
-      </w:hyperlink>
-    </w:p>
-    <w:bookmarkEnd w:id="106"/>
-    <w:bookmarkEnd w:id="107"/>
-    <w:sectPr/>
+        <w:t xml:space="preserve">, Vol. 51 No. 2, pp.251-263, https://doi.org/10.1016/j.jwb.2015.09.001</w:t>
+      </w:r>
+    </w:p>
+    <w:bookmarkEnd w:id="55"/>
+    <w:bookmarkEnd w:id="56"/>
+    <w:sectPr>
+      <w:pgSz w:h="16838" w:w="11906"/>
+      <w:pgMar w:bottom="1417" w:left="1417" w:right="1417" w:top="1417"/>
+    </w:sectPr>
   </w:body>
 </w:document>
 </file>
@@ -3449,29 +3608,59 @@
   <w:style w:default="1" w:styleId="Normal" w:type="paragraph">
     <w:name w:val="Normal"/>
     <w:qFormat/>
+    <w:pPr>
+      <w:spacing w:line="276" w:lineRule="auto"/>
+      <w:jc w:val="both"/>
+    </w:pPr>
+    <w:rPr>
+      <w:rFonts w:ascii="Times New Roman" w:eastAsia="Times New Roman" w:hAnsi="Times New Roman"/>
+      <w:color w:val="000000"/>
+      <w:sz w:val="24"/>
+    </w:rPr>
   </w:style>
   <w:style w:styleId="BodyText" w:type="paragraph">
     <w:name w:val="Body Text"/>
     <w:basedOn w:val="Normal"/>
     <w:link w:val="BodyTextChar"/>
     <w:pPr>
-      <w:spacing w:after="180" w:before="180"/>
+      <w:spacing w:after="180" w:before="180" w:line="276" w:lineRule="auto"/>
+      <w:jc w:val="both"/>
     </w:pPr>
     <w:qFormat/>
+    <w:rPr>
+      <w:rFonts w:ascii="Times New Roman" w:eastAsia="Times New Roman" w:hAnsi="Times New Roman"/>
+      <w:color w:val="000000"/>
+      <w:sz w:val="24"/>
+    </w:rPr>
   </w:style>
   <w:style w:customStyle="1" w:styleId="FirstParagraph" w:type="paragraph">
     <w:name w:val="First Paragraph"/>
     <w:basedOn w:val="BodyText"/>
     <w:next w:val="BodyText"/>
     <w:qFormat/>
+    <w:pPr>
+      <w:spacing w:line="276" w:lineRule="auto"/>
+      <w:jc w:val="both"/>
+    </w:pPr>
+    <w:rPr>
+      <w:rFonts w:ascii="Times New Roman" w:eastAsia="Times New Roman" w:hAnsi="Times New Roman"/>
+      <w:color w:val="000000"/>
+      <w:sz w:val="24"/>
+    </w:rPr>
   </w:style>
   <w:style w:customStyle="1" w:styleId="Compact" w:type="paragraph">
     <w:name w:val="Compact"/>
     <w:basedOn w:val="BodyText"/>
     <w:qFormat/>
     <w:pPr>
-      <w:spacing w:after="36" w:before="36"/>
+      <w:spacing w:after="36" w:before="36" w:line="276" w:lineRule="auto"/>
+      <w:jc w:val="both"/>
     </w:pPr>
+    <w:rPr>
+      <w:rFonts w:ascii="Times New Roman" w:eastAsia="Times New Roman" w:hAnsi="Times New Roman"/>
+      <w:color w:val="000000"/>
+      <w:sz w:val="24"/>
+    </w:rPr>
   </w:style>
   <w:style w:styleId="Title" w:type="paragraph">
     <w:name w:val="Title"/>
@@ -3481,15 +3670,15 @@
     <w:pPr>
       <w:keepNext/>
       <w:keepLines/>
-      <w:spacing w:after="240" w:before="480"/>
-      <w:jc w:val="center"/>
+      <w:spacing w:after="240" w:before="480" w:line="276" w:lineRule="auto"/>
+      <w:jc w:val="both"/>
     </w:pPr>
     <w:rPr>
-      <w:rFonts w:asciiTheme="majorHAnsi" w:cstheme="majorBidi" w:eastAsiaTheme="majorEastAsia" w:hAnsiTheme="majorHAnsi"/>
+      <w:rFonts w:ascii="Times New Roman" w:asciiTheme="majorHAnsi" w:cstheme="majorBidi" w:eastAsia="Times New Roman" w:eastAsiaTheme="majorEastAsia" w:hAnsi="Times New Roman" w:hAnsiTheme="majorHAnsi"/>
       <w:b/>
       <w:bCs/>
-      <w:color w:themeColor="accent1" w:themeShade="B5" w:val="345A8A"/>
-      <w:sz w:val="36"/>
+      <w:color w:val="000000"/>
+      <w:sz w:val="24"/>
       <w:szCs w:val="36"/>
     </w:rPr>
   </w:style>
@@ -3501,11 +3690,13 @@
     <w:pPr>
       <w:keepNext/>
       <w:keepLines/>
-      <w:spacing w:after="240" w:before="240"/>
-      <w:jc w:val="center"/>
+      <w:spacing w:after="240" w:before="240" w:line="276" w:lineRule="auto"/>
+      <w:jc w:val="both"/>
     </w:pPr>
     <w:rPr>
-      <w:sz w:val="30"/>
+      <w:rFonts w:ascii="Times New Roman" w:eastAsia="Times New Roman" w:hAnsi="Times New Roman"/>
+      <w:color w:val="000000"/>
+      <w:sz w:val="24"/>
       <w:szCs w:val="30"/>
     </w:rPr>
   </w:style>
@@ -3516,8 +3707,14 @@
     <w:pPr>
       <w:keepNext/>
       <w:keepLines/>
-      <w:jc w:val="center"/>
+      <w:spacing w:line="276" w:lineRule="auto"/>
+      <w:jc w:val="both"/>
     </w:pPr>
+    <w:rPr>
+      <w:rFonts w:ascii="Times New Roman" w:eastAsia="Times New Roman" w:hAnsi="Times New Roman"/>
+      <w:color w:val="000000"/>
+      <w:sz w:val="24"/>
+    </w:rPr>
   </w:style>
   <w:style w:styleId="Date" w:type="paragraph">
     <w:name w:val="Date"/>
@@ -3526,8 +3723,14 @@
     <w:pPr>
       <w:keepNext/>
       <w:keepLines/>
-      <w:jc w:val="center"/>
+      <w:spacing w:line="276" w:lineRule="auto"/>
+      <w:jc w:val="both"/>
     </w:pPr>
+    <w:rPr>
+      <w:rFonts w:ascii="Times New Roman" w:eastAsia="Times New Roman" w:hAnsi="Times New Roman"/>
+      <w:color w:val="000000"/>
+      <w:sz w:val="24"/>
+    </w:rPr>
   </w:style>
   <w:style w:customStyle="1" w:styleId="AbstractTitle" w:type="paragraph">
     <w:name w:val="Abstract Title"/>
@@ -3537,15 +3740,15 @@
     <w:pPr>
       <w:keepNext/>
       <w:keepLines/>
-      <w:jc w:val="center"/>
-      <w:spacing w:after="0" w:before="300"/>
+      <w:jc w:val="both"/>
+      <w:spacing w:after="0" w:before="300" w:line="276" w:lineRule="auto"/>
     </w:pPr>
     <w:rPr>
-      <w:sz w:val="20"/>
+      <w:color w:val="000000"/>
+      <w:sz w:val="24"/>
       <w:szCs w:val="20"/>
+      <w:rFonts w:ascii="Times New Roman" w:eastAsia="Times New Roman" w:hAnsi="Times New Roman"/>
       <w:b/>
-      <w:color w:val="345A8A"/>
-      &gt;
     </w:rPr>
   </w:style>
   <w:style w:customStyle="1" w:styleId="Abstract" w:type="paragraph">
@@ -3556,10 +3759,13 @@
     <w:pPr>
       <w:keepNext/>
       <w:keepLines/>
-      <w:spacing w:after="300" w:before="100"/>
+      <w:spacing w:after="300" w:before="100" w:line="276" w:lineRule="auto"/>
+      <w:jc w:val="both"/>
     </w:pPr>
     <w:rPr>
-      <w:sz w:val="20"/>
+      <w:rFonts w:ascii="Times New Roman" w:eastAsia="Times New Roman" w:hAnsi="Times New Roman"/>
+      <w:color w:val="000000"/>
+      <w:sz w:val="24"/>
       <w:szCs w:val="20"/>
     </w:rPr>
   </w:style>
@@ -3568,8 +3774,15 @@
     <w:basedOn w:val="Normal"/>
     <w:next w:val="Bibliography"/>
     <w:qFormat/>
-    <w:pPr/>
-    <w:rPr/>
+    <w:pPr>
+      <w:spacing w:line="276" w:lineRule="auto"/>
+      <w:jc w:val="both"/>
+    </w:pPr>
+    <w:rPr>
+      <w:rFonts w:ascii="Times New Roman" w:eastAsia="Times New Roman" w:hAnsi="Times New Roman"/>
+      <w:color w:val="000000"/>
+      <w:sz w:val="24"/>
+    </w:rPr>
   </w:style>
   <w:style w:styleId="Heading1" w:type="paragraph">
     <w:name w:val="Heading 1"/>
@@ -3580,15 +3793,16 @@
     <w:pPr>
       <w:keepNext/>
       <w:keepLines/>
-      <w:spacing w:after="0" w:before="480"/>
+      <w:spacing w:after="0" w:before="480" w:line="276" w:lineRule="auto"/>
+      <w:jc w:val="both"/>
       <w:outlineLvl w:val="0"/>
     </w:pPr>
     <w:rPr>
-      <w:rFonts w:asciiTheme="majorHAnsi" w:cstheme="majorBidi" w:eastAsiaTheme="majorEastAsia" w:hAnsiTheme="majorHAnsi"/>
+      <w:rFonts w:ascii="Times New Roman" w:asciiTheme="majorHAnsi" w:cstheme="majorBidi" w:eastAsia="Times New Roman" w:eastAsiaTheme="majorEastAsia" w:hAnsi="Times New Roman" w:hAnsiTheme="majorHAnsi"/>
       <w:b/>
       <w:bCs/>
-      <w:color w:themeColor="accent1" w:val="4F81BD"/>
-      <w:sz w:val="32"/>
+      <w:color w:val="000000"/>
+      <w:sz w:val="24"/>
       <w:szCs w:val="32"/>
     </w:rPr>
   </w:style>
@@ -3602,15 +3816,16 @@
     <w:pPr>
       <w:keepNext/>
       <w:keepLines/>
-      <w:spacing w:after="0" w:before="200"/>
+      <w:spacing w:after="0" w:before="200" w:line="276" w:lineRule="auto"/>
+      <w:jc w:val="both"/>
       <w:outlineLvl w:val="1"/>
     </w:pPr>
     <w:rPr>
-      <w:rFonts w:asciiTheme="majorHAnsi" w:cstheme="majorBidi" w:eastAsiaTheme="majorEastAsia" w:hAnsiTheme="majorHAnsi"/>
+      <w:rFonts w:ascii="Times New Roman" w:asciiTheme="majorHAnsi" w:cstheme="majorBidi" w:eastAsia="Times New Roman" w:eastAsiaTheme="majorEastAsia" w:hAnsi="Times New Roman" w:hAnsiTheme="majorHAnsi"/>
       <w:b/>
       <w:bCs/>
-      <w:color w:themeColor="accent1" w:val="4F81BD"/>
-      <w:sz w:val="28"/>
+      <w:color w:val="000000"/>
+      <w:sz w:val="24"/>
       <w:szCs w:val="28"/>
     </w:rPr>
   </w:style>
@@ -3624,14 +3839,15 @@
     <w:pPr>
       <w:keepNext/>
       <w:keepLines/>
-      <w:spacing w:after="0" w:before="200"/>
+      <w:spacing w:after="0" w:before="200" w:line="276" w:lineRule="auto"/>
+      <w:jc w:val="both"/>
       <w:outlineLvl w:val="2"/>
     </w:pPr>
     <w:rPr>
-      <w:rFonts w:asciiTheme="majorHAnsi" w:cstheme="majorBidi" w:eastAsiaTheme="majorEastAsia" w:hAnsiTheme="majorHAnsi"/>
+      <w:rFonts w:ascii="Times New Roman" w:asciiTheme="majorHAnsi" w:cstheme="majorBidi" w:eastAsia="Times New Roman" w:eastAsiaTheme="majorEastAsia" w:hAnsi="Times New Roman" w:hAnsiTheme="majorHAnsi"/>
       <w:b/>
       <w:bCs/>
-      <w:color w:themeColor="accent1" w:val="4F81BD"/>
+      <w:color w:val="000000"/>
       <w:sz w:val="24"/>
       <w:szCs w:val="24"/>
     </w:rPr>
@@ -3646,14 +3862,15 @@
     <w:pPr>
       <w:keepNext/>
       <w:keepLines/>
-      <w:spacing w:after="0" w:before="200"/>
+      <w:spacing w:after="0" w:before="200" w:line="276" w:lineRule="auto"/>
+      <w:jc w:val="both"/>
       <w:outlineLvl w:val="3"/>
     </w:pPr>
     <w:rPr>
-      <w:rFonts w:asciiTheme="majorHAnsi" w:cstheme="majorBidi" w:eastAsiaTheme="majorEastAsia" w:hAnsiTheme="majorHAnsi"/>
+      <w:rFonts w:ascii="Times New Roman" w:asciiTheme="majorHAnsi" w:cstheme="majorBidi" w:eastAsia="Times New Roman" w:eastAsiaTheme="majorEastAsia" w:hAnsi="Times New Roman" w:hAnsiTheme="majorHAnsi"/>
       <w:i/>
       <w:bCs/>
-      <w:color w:themeColor="accent1" w:val="4F81BD"/>
+      <w:color w:val="000000"/>
       <w:sz w:val="24"/>
       <w:szCs w:val="24"/>
     </w:rPr>
@@ -3668,13 +3885,14 @@
     <w:pPr>
       <w:keepNext/>
       <w:keepLines/>
-      <w:spacing w:after="0" w:before="200"/>
+      <w:spacing w:after="0" w:before="200" w:line="276" w:lineRule="auto"/>
+      <w:jc w:val="both"/>
       <w:outlineLvl w:val="4"/>
     </w:pPr>
     <w:rPr>
-      <w:rFonts w:asciiTheme="majorHAnsi" w:cstheme="majorBidi" w:eastAsiaTheme="majorEastAsia" w:hAnsiTheme="majorHAnsi"/>
+      <w:rFonts w:ascii="Times New Roman" w:asciiTheme="majorHAnsi" w:cstheme="majorBidi" w:eastAsia="Times New Roman" w:eastAsiaTheme="majorEastAsia" w:hAnsi="Times New Roman" w:hAnsiTheme="majorHAnsi"/>
       <w:iCs/>
-      <w:color w:themeColor="accent1" w:val="4F81BD"/>
+      <w:color w:val="000000"/>
       <w:sz w:val="24"/>
       <w:szCs w:val="24"/>
     </w:rPr>
@@ -3689,12 +3907,13 @@
     <w:pPr>
       <w:keepNext/>
       <w:keepLines/>
-      <w:spacing w:after="0" w:before="200"/>
+      <w:spacing w:after="0" w:before="200" w:line="276" w:lineRule="auto"/>
+      <w:jc w:val="both"/>
       <w:outlineLvl w:val="5"/>
     </w:pPr>
     <w:rPr>
-      <w:rFonts w:asciiTheme="majorHAnsi" w:cstheme="majorBidi" w:eastAsiaTheme="majorEastAsia" w:hAnsiTheme="majorHAnsi"/>
-      <w:color w:themeColor="accent1" w:val="4F81BD"/>
+      <w:rFonts w:ascii="Times New Roman" w:asciiTheme="majorHAnsi" w:cstheme="majorBidi" w:eastAsia="Times New Roman" w:eastAsiaTheme="majorEastAsia" w:hAnsi="Times New Roman" w:hAnsiTheme="majorHAnsi"/>
+      <w:color w:val="000000"/>
       <w:sz w:val="24"/>
       <w:szCs w:val="24"/>
     </w:rPr>
@@ -3709,12 +3928,13 @@
     <w:pPr>
       <w:keepNext/>
       <w:keepLines/>
-      <w:spacing w:after="0" w:before="200"/>
+      <w:spacing w:after="0" w:before="200" w:line="276" w:lineRule="auto"/>
+      <w:jc w:val="both"/>
       <w:outlineLvl w:val="6"/>
     </w:pPr>
     <w:rPr>
-      <w:rFonts w:asciiTheme="majorHAnsi" w:cstheme="majorBidi" w:eastAsiaTheme="majorEastAsia" w:hAnsiTheme="majorHAnsi"/>
-      <w:color w:themeColor="accent1" w:val="4F81BD"/>
+      <w:rFonts w:ascii="Times New Roman" w:asciiTheme="majorHAnsi" w:cstheme="majorBidi" w:eastAsia="Times New Roman" w:eastAsiaTheme="majorEastAsia" w:hAnsi="Times New Roman" w:hAnsiTheme="majorHAnsi"/>
+      <w:color w:val="000000"/>
       <w:sz w:val="24"/>
       <w:szCs w:val="24"/>
     </w:rPr>
@@ -3729,12 +3949,13 @@
     <w:pPr>
       <w:keepNext/>
       <w:keepLines/>
-      <w:spacing w:after="0" w:before="200"/>
+      <w:spacing w:after="0" w:before="200" w:line="276" w:lineRule="auto"/>
+      <w:jc w:val="both"/>
       <w:outlineLvl w:val="7"/>
     </w:pPr>
     <w:rPr>
-      <w:rFonts w:asciiTheme="majorHAnsi" w:cstheme="majorBidi" w:eastAsiaTheme="majorEastAsia" w:hAnsiTheme="majorHAnsi"/>
-      <w:color w:themeColor="accent1" w:val="4F81BD"/>
+      <w:rFonts w:ascii="Times New Roman" w:asciiTheme="majorHAnsi" w:cstheme="majorBidi" w:eastAsia="Times New Roman" w:eastAsiaTheme="majorEastAsia" w:hAnsi="Times New Roman" w:hAnsiTheme="majorHAnsi"/>
+      <w:color w:val="000000"/>
       <w:sz w:val="24"/>
       <w:szCs w:val="24"/>
     </w:rPr>
@@ -3749,12 +3970,13 @@
     <w:pPr>
       <w:keepNext/>
       <w:keepLines/>
-      <w:spacing w:after="0" w:before="200"/>
+      <w:spacing w:after="0" w:before="200" w:line="276" w:lineRule="auto"/>
+      <w:jc w:val="both"/>
       <w:outlineLvl w:val="8"/>
     </w:pPr>
     <w:rPr>
-      <w:rFonts w:asciiTheme="majorHAnsi" w:cstheme="majorBidi" w:eastAsiaTheme="majorEastAsia" w:hAnsiTheme="majorHAnsi"/>
-      <w:color w:themeColor="accent1" w:val="4F81BD"/>
+      <w:rFonts w:ascii="Times New Roman" w:asciiTheme="majorHAnsi" w:cstheme="majorBidi" w:eastAsia="Times New Roman" w:eastAsiaTheme="majorEastAsia" w:hAnsi="Times New Roman" w:hAnsiTheme="majorHAnsi"/>
+      <w:color w:val="000000"/>
       <w:sz w:val="24"/>
       <w:szCs w:val="24"/>
     </w:rPr>
@@ -3767,9 +3989,15 @@
     <w:unhideWhenUsed/>
     <w:qFormat/>
     <w:pPr>
-      <w:spacing w:after="100" w:before="100"/>
+      <w:spacing w:after="100" w:before="100" w:line="276" w:lineRule="auto"/>
       <w:ind w:firstLine="0" w:left="480" w:right="480"/>
+      <w:jc w:val="both"/>
     </w:pPr>
+    <w:rPr>
+      <w:rFonts w:ascii="Times New Roman" w:eastAsia="Times New Roman" w:hAnsi="Times New Roman"/>
+      <w:color w:val="000000"/>
+      <w:sz w:val="24"/>
+    </w:rPr>
   </w:style>
   <w:style w:styleId="FootnoteText" w:type="paragraph">
     <w:name w:val="Footnote Text"/>
@@ -3778,11 +4006,25 @@
     <w:uiPriority w:val="9"/>
     <w:unhideWhenUsed/>
     <w:qFormat/>
+    <w:pPr>
+      <w:spacing w:line="276" w:lineRule="auto"/>
+      <w:jc w:val="both"/>
+    </w:pPr>
+    <w:rPr>
+      <w:rFonts w:ascii="Times New Roman" w:eastAsia="Times New Roman" w:hAnsi="Times New Roman"/>
+      <w:color w:val="000000"/>
+      <w:sz w:val="24"/>
+    </w:rPr>
   </w:style>
   <w:style w:default="1" w:styleId="DefaultParagraphFont" w:type="character">
     <w:name w:val="Default Paragraph Font"/>
     <w:semiHidden/>
     <w:unhideWhenUsed/>
+    <w:rPr>
+      <w:rFonts w:ascii="Times New Roman" w:eastAsia="Times New Roman" w:hAnsi="Times New Roman"/>
+      <w:color w:val="000000"/>
+      <w:sz w:val="24"/>
+    </w:rPr>
   </w:style>
   <w:style w:default="1" w:styleId="Table" w:type="table">
     <w:name w:val="Table"/>
@@ -3790,6 +4032,15 @@
     <w:semiHidden/>
     <w:unhideWhenUsed/>
     <w:qFormat/>
+    <w:pPr>
+      <w:spacing w:line="276" w:lineRule="auto"/>
+      <w:jc w:val="both"/>
+    </w:pPr>
+    <w:rPr>
+      <w:rFonts w:ascii="Times New Roman" w:eastAsia="Times New Roman" w:hAnsi="Times New Roman"/>
+      <w:color w:val="000000"/>
+      <w:sz w:val="24"/>
+    </w:rPr>
     <w:tblPr>
       <w:tblInd w:type="dxa" w:w="0"/>
       <w:tblCellMar>
@@ -3822,25 +4073,42 @@
     <w:pPr>
       <w:keepNext/>
       <w:keepLines/>
-      <w:spacing w:after="0"/>
+      <w:spacing w:after="0" w:line="276" w:lineRule="auto"/>
+      <w:jc w:val="both"/>
     </w:pPr>
     <w:rPr>
+      <w:rFonts w:ascii="Times New Roman" w:eastAsia="Times New Roman" w:hAnsi="Times New Roman"/>
       <w:b/>
+      <w:color w:val="000000"/>
+      <w:sz w:val="24"/>
     </w:rPr>
   </w:style>
   <w:style w:customStyle="1" w:styleId="Definition" w:type="paragraph">
     <w:name w:val="Definition"/>
     <w:basedOn w:val="Normal"/>
+    <w:pPr>
+      <w:spacing w:line="276" w:lineRule="auto"/>
+      <w:jc w:val="both"/>
+    </w:pPr>
+    <w:rPr>
+      <w:rFonts w:ascii="Times New Roman" w:eastAsia="Times New Roman" w:hAnsi="Times New Roman"/>
+      <w:color w:val="000000"/>
+      <w:sz w:val="24"/>
+    </w:rPr>
   </w:style>
   <w:style w:styleId="Caption" w:type="paragraph">
     <w:name w:val="Caption"/>
     <w:basedOn w:val="Normal"/>
     <w:link w:val="BodyTextChar"/>
     <w:pPr>
-      <w:spacing w:after="120" w:before="0"/>
+      <w:spacing w:after="120" w:before="0" w:line="276" w:lineRule="auto"/>
+      <w:jc w:val="both"/>
     </w:pPr>
     <w:rPr>
+      <w:rFonts w:ascii="Times New Roman" w:eastAsia="Times New Roman" w:hAnsi="Times New Roman"/>
       <w:i/>
+      <w:color w:val="000000"/>
+      <w:sz w:val="24"/>
     </w:rPr>
   </w:style>
   <w:style w:customStyle="1" w:styleId="TableCaption" w:type="paragraph">
@@ -3848,44 +4116,90 @@
     <w:basedOn w:val="Caption"/>
     <w:pPr>
       <w:keepNext/>
+      <w:spacing w:line="276" w:lineRule="auto"/>
+      <w:jc w:val="both"/>
     </w:pPr>
+    <w:rPr>
+      <w:rFonts w:ascii="Times New Roman" w:eastAsia="Times New Roman" w:hAnsi="Times New Roman"/>
+      <w:color w:val="000000"/>
+      <w:sz w:val="24"/>
+    </w:rPr>
   </w:style>
   <w:style w:customStyle="1" w:styleId="ImageCaption" w:type="paragraph">
     <w:name w:val="Image Caption"/>
     <w:basedOn w:val="Caption"/>
+    <w:pPr>
+      <w:spacing w:line="276" w:lineRule="auto"/>
+      <w:jc w:val="both"/>
+    </w:pPr>
+    <w:rPr>
+      <w:rFonts w:ascii="Times New Roman" w:eastAsia="Times New Roman" w:hAnsi="Times New Roman"/>
+      <w:color w:val="000000"/>
+      <w:sz w:val="24"/>
+    </w:rPr>
   </w:style>
   <w:style w:customStyle="1" w:styleId="Figure" w:type="paragraph">
     <w:name w:val="Figure"/>
     <w:basedOn w:val="Normal"/>
+    <w:pPr>
+      <w:spacing w:line="276" w:lineRule="auto"/>
+      <w:jc w:val="both"/>
+    </w:pPr>
+    <w:rPr>
+      <w:rFonts w:ascii="Times New Roman" w:eastAsia="Times New Roman" w:hAnsi="Times New Roman"/>
+      <w:color w:val="000000"/>
+      <w:sz w:val="24"/>
+    </w:rPr>
   </w:style>
   <w:style w:customStyle="1" w:styleId="CaptionedFigure" w:type="paragraph">
     <w:name w:val="Captioned Figure"/>
     <w:basedOn w:val="Figure"/>
     <w:pPr>
       <w:keepNext/>
+      <w:spacing w:line="276" w:lineRule="auto"/>
+      <w:jc w:val="both"/>
     </w:pPr>
+    <w:rPr>
+      <w:rFonts w:ascii="Times New Roman" w:eastAsia="Times New Roman" w:hAnsi="Times New Roman"/>
+      <w:color w:val="000000"/>
+      <w:sz w:val="24"/>
+    </w:rPr>
   </w:style>
   <w:style w:customStyle="1" w:styleId="BodyTextChar" w:type="character">
     <w:name w:val="Body Text Char"/>
     <w:basedOn w:val="DefaultParagraphFont"/>
     <w:link w:val="BodyText"/>
+    <w:rPr>
+      <w:rFonts w:ascii="Times New Roman" w:eastAsia="Times New Roman" w:hAnsi="Times New Roman"/>
+      <w:color w:val="000000"/>
+      <w:sz w:val="24"/>
+    </w:rPr>
   </w:style>
   <w:style w:customStyle="1" w:styleId="VerbatimChar" w:type="character">
     <w:name w:val="Verbatim Char"/>
     <w:basedOn w:val="BodyTextChar"/>
     <w:rPr>
-      <w:rFonts w:ascii="Consolas" w:hAnsi="Consolas"/>
-      <w:sz w:val="22"/>
+      <w:rFonts w:ascii="Times New Roman" w:eastAsia="Times New Roman" w:hAnsi="Times New Roman"/>
+      <w:color w:val="000000"/>
+      <w:sz w:val="24"/>
     </w:rPr>
   </w:style>
   <w:style w:customStyle="1" w:styleId="SectionNumber" w:type="character">
     <w:name w:val="Section Number"/>
     <w:basedOn w:val="BodyTextChar"/>
+    <w:rPr>
+      <w:rFonts w:ascii="Times New Roman" w:eastAsia="Times New Roman" w:hAnsi="Times New Roman"/>
+      <w:color w:val="000000"/>
+      <w:sz w:val="24"/>
+    </w:rPr>
   </w:style>
   <w:style w:styleId="FootnoteReference" w:type="character">
     <w:name w:val="Footnote Reference"/>
     <w:basedOn w:val="BodyTextChar"/>
     <w:rPr>
+      <w:rFonts w:ascii="Times New Roman" w:eastAsia="Times New Roman" w:hAnsi="Times New Roman"/>
+      <w:color w:val="000000"/>
+      <w:sz w:val="24"/>
       <w:vertAlign w:val="superscript"/>
     </w:rPr>
   </w:style>
@@ -3893,7 +4207,9 @@
     <w:name w:val="Hyperlink"/>
     <w:basedOn w:val="BodyTextChar"/>
     <w:rPr>
-      <w:color w:themeColor="accent1" w:val="4F81BD"/>
+      <w:rFonts w:ascii="Times New Roman" w:eastAsia="Times New Roman" w:hAnsi="Times New Roman"/>
+      <w:color w:val="000000"/>
+      <w:sz w:val="24"/>
     </w:rPr>
   </w:style>
   <w:style w:styleId="TOCHeading" w:type="paragraph">
@@ -3904,14 +4220,16 @@
     <w:unhideWhenUsed/>
     <w:qFormat/>
     <w:pPr>
-      <w:spacing w:before="240" w:line="259" w:lineRule="auto"/>
+      <w:spacing w:before="240" w:line="276" w:lineRule="auto"/>
+      <w:jc w:val="both"/>
       <w:outlineLvl w:val="9"/>
     </w:pPr>
     <w:rPr>
-      <w:rFonts w:asciiTheme="majorHAnsi" w:cstheme="majorBidi" w:eastAsiaTheme="majorEastAsia" w:hAnsiTheme="majorHAnsi"/>
+      <w:rFonts w:ascii="Times New Roman" w:asciiTheme="majorHAnsi" w:cstheme="majorBidi" w:eastAsia="Times New Roman" w:eastAsiaTheme="majorEastAsia" w:hAnsi="Times New Roman" w:hAnsiTheme="majorHAnsi"/>
       <w:b w:val="0"/>
       <w:bCs w:val="0"/>
-      <w:color w:themeColor="accent1" w:themeShade="BF" w:val="365F91"/>
+      <w:color w:val="000000"/>
+      <w:sz w:val="24"/>
     </w:rPr>
   </w:style>
   <w:style w:type="paragraph" w:customStyle="1" w:styleId="SourceCode">

</xml_diff>